<commit_message>
docs: rewrite README and handover documents for project users
</commit_message>
<xml_diff>
--- a/docs/handover/word/BACKLOG.docx
+++ b/docs/handover/word/BACKLOG.docx
@@ -7,7 +7,7 @@
         <w:pStyle w:val="Title"/>
       </w:pPr>
       <w:r>
-        <w:t>Kế hoạch phát triển tiếp theo của ITAM</w:t>
+        <w:t>KẾ HOẠCH PHÁT TRIỂN TIẾP THEO CỦA ITAM</w:t>
       </w:r>
     </w:p>
     <w:p>
@@ -20,7 +20,7 @@
         <w:pStyle w:val="Heading1"/>
       </w:pPr>
       <w:r>
-        <w:t>Nguyên tắc lựa chọn</w:t>
+        <w:t>NGUYÊN TẮC LỰA CHỌN</w:t>
       </w:r>
     </w:p>
     <w:p>
@@ -33,7 +33,7 @@
         <w:pStyle w:val="Heading1"/>
       </w:pPr>
       <w:r>
-        <w:t>Ưu tiên 1 Nghiệm thu môi trường bàn giao</w:t>
+        <w:t>ƯU TIÊN 1 NGHIỆM THU MÔI TRƯỜNG BÀN GIAO</w:t>
       </w:r>
     </w:p>
     <w:p>
@@ -78,7 +78,7 @@
         <w:pStyle w:val="Heading1"/>
       </w:pPr>
       <w:r>
-        <w:t>Ưu tiên 1 Chuẩn hóa bộ dữ liệu demo</w:t>
+        <w:t>ƯU TIÊN 1 CHUẨN HÓA BỘ DỮ LIỆU DEMO</w:t>
       </w:r>
     </w:p>
     <w:p>
@@ -123,7 +123,7 @@
         <w:pStyle w:val="Heading1"/>
       </w:pPr>
       <w:r>
-        <w:t>Ưu tiên 2 Thay linh kiện trên thiết bị đang sử dụng</w:t>
+        <w:t>ƯU TIÊN 2 THAY LINH KIỆN TRÊN THIẾT BỊ ĐANG SỬ DỤNG</w:t>
       </w:r>
     </w:p>
     <w:p>
@@ -176,7 +176,7 @@
         <w:pStyle w:val="Heading1"/>
       </w:pPr>
       <w:r>
-        <w:t>Ưu tiên 2 Hoàn thiện vận hành và kiểm thử tự động</w:t>
+        <w:t>ƯU TIÊN 2 HOÀN THIỆN VẬN HÀNH VÀ KIỂM THỬ TỰ ĐỘNG</w:t>
       </w:r>
     </w:p>
     <w:p>
@@ -216,7 +216,7 @@
         <w:pStyle w:val="Heading1"/>
       </w:pPr>
       <w:r>
-        <w:t>Trước production Quản lý chứng từ thật</w:t>
+        <w:t>TRƯỚC PRODUCTION QUẢN LÝ CHỨNG TỪ THẬT</w:t>
       </w:r>
     </w:p>
     <w:p>
@@ -253,7 +253,7 @@
         <w:pStyle w:val="Heading1"/>
       </w:pPr>
       <w:r>
-        <w:t>Trước production Gửi email thật</w:t>
+        <w:t>TRƯỚC PRODUCTION GỬI EMAIL THẬT</w:t>
       </w:r>
     </w:p>
     <w:p>
@@ -293,7 +293,7 @@
         <w:pStyle w:val="Heading1"/>
       </w:pPr>
       <w:r>
-        <w:t>Trước production Tài khoản và bảo mật cấu hình</w:t>
+        <w:t>TRƯỚC PRODUCTION TÀI KHOẢN VÀ BẢO MẬT CẤU HÌNH</w:t>
       </w:r>
     </w:p>
     <w:p>
@@ -333,7 +333,7 @@
         <w:pStyle w:val="Heading1"/>
       </w:pPr>
       <w:r>
-        <w:t>Theo nhu cầu Báo cáo nâng cao</w:t>
+        <w:t>THEO NHU CẦU BÁO CÁO NÂNG CAO</w:t>
       </w:r>
     </w:p>
     <w:p>
@@ -370,7 +370,7 @@
         <w:pStyle w:val="Heading1"/>
       </w:pPr>
       <w:r>
-        <w:t>Ngoài phạm vi mặc định</w:t>
+        <w:t>NGOÀI PHẠM VI MẶC ĐỊNH</w:t>
       </w:r>
     </w:p>
     <w:p>
@@ -383,7 +383,7 @@
         <w:pStyle w:val="Heading1"/>
       </w:pPr>
       <w:r>
-        <w:t>Thông tin cần có khi giao việc</w:t>
+        <w:t>THÔNG TIN CẦN CÓ KHI GIAO VIỆC</w:t>
       </w:r>
     </w:p>
     <w:p>
@@ -411,6 +411,7 @@
     </w:pPr>
     <w:r>
       <w:rPr>
+        <w:rFonts w:ascii="Times New Roman" w:hAnsi="Times New Roman" w:cs="Times New Roman" w:eastAsia="Times New Roman"/>
         <w:sz w:val="18"/>
       </w:rPr>
       <w:t xml:space="preserve">ITAM  |  </w:t>
@@ -628,9 +629,9 @@
   <w:docDefaults>
     <w:rPrDefault>
       <w:rPr>
-        <w:rFonts w:asciiTheme="minorHAnsi" w:eastAsiaTheme="minorEastAsia" w:hAnsiTheme="minorHAnsi" w:cstheme="minorBidi"/>
-        <w:sz w:val="22"/>
-        <w:szCs w:val="22"/>
+        <w:rFonts w:ascii="Times New Roman" w:hAnsi="Times New Roman" w:cs="Times New Roman" w:eastAsia="Times New Roman"/>
+        <w:sz w:val="26"/>
+        <w:szCs w:val="26"/>
         <w:lang w:val="en-US" w:eastAsia="en-US" w:bidi="ar-SA"/>
       </w:rPr>
     </w:rPrDefault>
@@ -787,9 +788,10 @@
       <w:spacing w:after="120" w:line="259" w:lineRule="auto"/>
     </w:pPr>
     <w:rPr>
-      <w:rFonts w:ascii="Calibri" w:hAnsi="Calibri"/>
+      <w:rFonts w:ascii="Times New Roman" w:hAnsi="Times New Roman" w:cs="Times New Roman" w:eastAsia="Times New Roman"/>
       <w:color w:val="000000"/>
-      <w:sz w:val="22"/>
+      <w:sz w:val="26"/>
+      <w:szCs w:val="26"/>
     </w:rPr>
   </w:style>
   <w:style w:type="paragraph" w:styleId="Header">
@@ -851,12 +853,13 @@
       <w:outlineLvl w:val="0"/>
     </w:pPr>
     <w:rPr>
-      <w:rFonts w:asciiTheme="majorHAnsi" w:eastAsiaTheme="majorEastAsia" w:hAnsiTheme="majorHAnsi" w:cstheme="majorBidi" w:ascii="Calibri" w:hAnsi="Calibri"/>
+      <w:rFonts w:ascii="Times New Roman" w:hAnsi="Times New Roman" w:cs="Times New Roman" w:eastAsia="Times New Roman"/>
       <w:b/>
       <w:bCs/>
       <w:color w:val="000000"/>
-      <w:sz w:val="32"/>
+      <w:sz w:val="28"/>
       <w:szCs w:val="28"/>
+      <w:caps/>
     </w:rPr>
   </w:style>
   <w:style w:type="paragraph" w:styleId="Heading2">
@@ -875,12 +878,13 @@
       <w:outlineLvl w:val="1"/>
     </w:pPr>
     <w:rPr>
-      <w:rFonts w:asciiTheme="majorHAnsi" w:eastAsiaTheme="majorEastAsia" w:hAnsiTheme="majorHAnsi" w:cstheme="majorBidi" w:ascii="Calibri" w:hAnsi="Calibri"/>
+      <w:rFonts w:ascii="Times New Roman" w:hAnsi="Times New Roman" w:cs="Times New Roman" w:eastAsia="Times New Roman"/>
       <w:b/>
       <w:bCs/>
       <w:color w:val="000000"/>
-      <w:sz w:val="26"/>
-      <w:szCs w:val="26"/>
+      <w:sz w:val="28"/>
+      <w:szCs w:val="28"/>
+      <w:caps/>
     </w:rPr>
   </w:style>
   <w:style w:type="paragraph" w:styleId="Heading3">
@@ -899,7 +903,7 @@
       <w:outlineLvl w:val="2"/>
     </w:pPr>
     <w:rPr>
-      <w:rFonts w:asciiTheme="majorHAnsi" w:eastAsiaTheme="majorEastAsia" w:hAnsiTheme="majorHAnsi" w:cstheme="majorBidi" w:ascii="Calibri" w:hAnsi="Calibri"/>
+      <w:rFonts w:ascii="Times New Roman" w:hAnsi="Times New Roman" w:cs="Times New Roman" w:eastAsia="Times New Roman"/>
       <w:b/>
       <w:bCs/>
       <w:color w:val="000000"/>
@@ -923,7 +927,7 @@
       <w:outlineLvl w:val="3"/>
     </w:pPr>
     <w:rPr>
-      <w:rFonts w:asciiTheme="majorHAnsi" w:eastAsiaTheme="majorEastAsia" w:hAnsiTheme="majorHAnsi" w:cstheme="majorBidi"/>
+      <w:rFonts w:ascii="Times New Roman" w:hAnsi="Times New Roman" w:cs="Times New Roman" w:eastAsia="Times New Roman"/>
       <w:b/>
       <w:bCs/>
       <w:i/>
@@ -948,7 +952,7 @@
       <w:outlineLvl w:val="4"/>
     </w:pPr>
     <w:rPr>
-      <w:rFonts w:asciiTheme="majorHAnsi" w:eastAsiaTheme="majorEastAsia" w:hAnsiTheme="majorHAnsi" w:cstheme="majorBidi"/>
+      <w:rFonts w:ascii="Times New Roman" w:hAnsi="Times New Roman" w:cs="Times New Roman" w:eastAsia="Times New Roman"/>
       <w:color w:val="243F60" w:themeColor="accent1" w:themeShade="7F"/>
     </w:rPr>
   </w:style>
@@ -969,7 +973,7 @@
       <w:outlineLvl w:val="5"/>
     </w:pPr>
     <w:rPr>
-      <w:rFonts w:asciiTheme="majorHAnsi" w:eastAsiaTheme="majorEastAsia" w:hAnsiTheme="majorHAnsi" w:cstheme="majorBidi"/>
+      <w:rFonts w:ascii="Times New Roman" w:hAnsi="Times New Roman" w:cs="Times New Roman" w:eastAsia="Times New Roman"/>
       <w:i/>
       <w:iCs/>
       <w:color w:val="243F60" w:themeColor="accent1" w:themeShade="7F"/>
@@ -992,7 +996,7 @@
       <w:outlineLvl w:val="6"/>
     </w:pPr>
     <w:rPr>
-      <w:rFonts w:asciiTheme="majorHAnsi" w:eastAsiaTheme="majorEastAsia" w:hAnsiTheme="majorHAnsi" w:cstheme="majorBidi"/>
+      <w:rFonts w:ascii="Times New Roman" w:hAnsi="Times New Roman" w:cs="Times New Roman" w:eastAsia="Times New Roman"/>
       <w:i/>
       <w:iCs/>
       <w:color w:val="404040" w:themeColor="text1" w:themeTint="BF"/>
@@ -1015,7 +1019,7 @@
       <w:outlineLvl w:val="7"/>
     </w:pPr>
     <w:rPr>
-      <w:rFonts w:asciiTheme="majorHAnsi" w:eastAsiaTheme="majorEastAsia" w:hAnsiTheme="majorHAnsi" w:cstheme="majorBidi"/>
+      <w:rFonts w:ascii="Times New Roman" w:hAnsi="Times New Roman" w:cs="Times New Roman" w:eastAsia="Times New Roman"/>
       <w:color w:val="4F81BD" w:themeColor="accent1"/>
       <w:sz w:val="20"/>
       <w:szCs w:val="20"/>
@@ -1038,7 +1042,7 @@
       <w:outlineLvl w:val="8"/>
     </w:pPr>
     <w:rPr>
-      <w:rFonts w:asciiTheme="majorHAnsi" w:eastAsiaTheme="majorEastAsia" w:hAnsiTheme="majorHAnsi" w:cstheme="majorBidi"/>
+      <w:rFonts w:ascii="Times New Roman" w:hAnsi="Times New Roman" w:cs="Times New Roman" w:eastAsia="Times New Roman"/>
       <w:i/>
       <w:iCs/>
       <w:color w:val="404040" w:themeColor="text1" w:themeTint="BF"/>
@@ -1089,7 +1093,7 @@
     <w:uiPriority w:val="9"/>
     <w:rsid w:val="00FC693F"/>
     <w:rPr>
-      <w:rFonts w:asciiTheme="majorHAnsi" w:eastAsiaTheme="majorEastAsia" w:hAnsiTheme="majorHAnsi" w:cstheme="majorBidi"/>
+      <w:rFonts w:ascii="Times New Roman" w:hAnsi="Times New Roman" w:cs="Times New Roman" w:eastAsia="Times New Roman"/>
       <w:b/>
       <w:bCs/>
       <w:color w:val="365F91" w:themeColor="accent1" w:themeShade="BF"/>
@@ -1104,7 +1108,7 @@
     <w:uiPriority w:val="9"/>
     <w:rsid w:val="00FC693F"/>
     <w:rPr>
-      <w:rFonts w:asciiTheme="majorHAnsi" w:eastAsiaTheme="majorEastAsia" w:hAnsiTheme="majorHAnsi" w:cstheme="majorBidi"/>
+      <w:rFonts w:ascii="Times New Roman" w:hAnsi="Times New Roman" w:cs="Times New Roman" w:eastAsia="Times New Roman"/>
       <w:b/>
       <w:bCs/>
       <w:color w:val="4F81BD" w:themeColor="accent1"/>
@@ -1119,7 +1123,7 @@
     <w:uiPriority w:val="9"/>
     <w:rsid w:val="00FC693F"/>
     <w:rPr>
-      <w:rFonts w:asciiTheme="majorHAnsi" w:eastAsiaTheme="majorEastAsia" w:hAnsiTheme="majorHAnsi" w:cstheme="majorBidi"/>
+      <w:rFonts w:ascii="Times New Roman" w:hAnsi="Times New Roman" w:cs="Times New Roman" w:eastAsia="Times New Roman"/>
       <w:b/>
       <w:bCs/>
       <w:color w:val="4F81BD" w:themeColor="accent1"/>
@@ -1141,12 +1145,15 @@
       <w:contextualSpacing/>
     </w:pPr>
     <w:rPr>
-      <w:rFonts w:asciiTheme="majorHAnsi" w:eastAsiaTheme="majorEastAsia" w:hAnsiTheme="majorHAnsi" w:cstheme="majorBidi" w:ascii="Calibri" w:hAnsi="Calibri"/>
+      <w:rFonts w:ascii="Times New Roman" w:hAnsi="Times New Roman" w:cs="Times New Roman" w:eastAsia="Times New Roman"/>
       <w:color w:val="000000"/>
       <w:spacing w:val="5"/>
       <w:kern w:val="28"/>
-      <w:sz w:val="46"/>
-      <w:szCs w:val="52"/>
+      <w:sz w:val="28"/>
+      <w:szCs w:val="28"/>
+      <w:b/>
+      <w:bCs/>
+      <w:caps/>
     </w:rPr>
   </w:style>
   <w:style w:type="character" w:customStyle="1" w:styleId="TitleChar">
@@ -1156,7 +1163,7 @@
     <w:uiPriority w:val="10"/>
     <w:rsid w:val="00FC693F"/>
     <w:rPr>
-      <w:rFonts w:asciiTheme="majorHAnsi" w:eastAsiaTheme="majorEastAsia" w:hAnsiTheme="majorHAnsi" w:cstheme="majorBidi"/>
+      <w:rFonts w:ascii="Times New Roman" w:hAnsi="Times New Roman" w:cs="Times New Roman" w:eastAsia="Times New Roman"/>
       <w:color w:val="17365D" w:themeColor="text2" w:themeShade="BF"/>
       <w:spacing w:val="5"/>
       <w:kern w:val="28"/>
@@ -1178,7 +1185,7 @@
       </w:numPr>
     </w:pPr>
     <w:rPr>
-      <w:rFonts w:asciiTheme="majorHAnsi" w:eastAsiaTheme="majorEastAsia" w:hAnsiTheme="majorHAnsi" w:cstheme="majorBidi"/>
+      <w:rFonts w:ascii="Times New Roman" w:hAnsi="Times New Roman" w:cs="Times New Roman" w:eastAsia="Times New Roman"/>
       <w:i/>
       <w:iCs/>
       <w:color w:val="4F81BD" w:themeColor="accent1"/>
@@ -1194,7 +1201,7 @@
     <w:uiPriority w:val="11"/>
     <w:rsid w:val="00FC693F"/>
     <w:rPr>
-      <w:rFonts w:asciiTheme="majorHAnsi" w:eastAsiaTheme="majorEastAsia" w:hAnsiTheme="majorHAnsi" w:cstheme="majorBidi"/>
+      <w:rFonts w:ascii="Times New Roman" w:hAnsi="Times New Roman" w:cs="Times New Roman" w:eastAsia="Times New Roman"/>
       <w:i/>
       <w:iCs/>
       <w:color w:val="4F81BD" w:themeColor="accent1"/>
@@ -1322,8 +1329,10 @@
       <w:contextualSpacing/>
     </w:pPr>
     <w:rPr>
-      <w:rFonts w:ascii="Calibri" w:hAnsi="Calibri"/>
+      <w:rFonts w:ascii="Times New Roman" w:hAnsi="Times New Roman" w:cs="Times New Roman" w:eastAsia="Times New Roman"/>
       <w:color w:val="000000"/>
+      <w:sz w:val="26"/>
+      <w:szCs w:val="26"/>
     </w:rPr>
   </w:style>
   <w:style w:type="paragraph" w:styleId="ListBullet2">
@@ -1365,7 +1374,7 @@
       <w:contextualSpacing/>
     </w:pPr>
     <w:rPr>
-      <w:rFonts w:ascii="Calibri" w:hAnsi="Calibri"/>
+      <w:rFonts w:ascii="Times New Roman" w:hAnsi="Times New Roman" w:cs="Times New Roman" w:eastAsia="Times New Roman"/>
       <w:color w:val="000000"/>
     </w:rPr>
   </w:style>
@@ -1449,7 +1458,7 @@
       </w:tabs>
     </w:pPr>
     <w:rPr>
-      <w:rFonts w:ascii="Courier" w:hAnsi="Courier"/>
+      <w:rFonts w:ascii="Times New Roman" w:hAnsi="Times New Roman" w:cs="Times New Roman" w:eastAsia="Times New Roman"/>
       <w:sz w:val="20"/>
       <w:szCs w:val="20"/>
     </w:rPr>
@@ -1461,7 +1470,7 @@
     <w:uiPriority w:val="99"/>
     <w:rsid w:val="0029639D"/>
     <w:rPr>
-      <w:rFonts w:ascii="Courier" w:hAnsi="Courier"/>
+      <w:rFonts w:ascii="Times New Roman" w:hAnsi="Times New Roman" w:cs="Times New Roman" w:eastAsia="Times New Roman"/>
       <w:sz w:val="20"/>
       <w:szCs w:val="20"/>
     </w:rPr>
@@ -1500,7 +1509,7 @@
     <w:semiHidden/>
     <w:rsid w:val="00FC693F"/>
     <w:rPr>
-      <w:rFonts w:asciiTheme="majorHAnsi" w:eastAsiaTheme="majorEastAsia" w:hAnsiTheme="majorHAnsi" w:cstheme="majorBidi"/>
+      <w:rFonts w:ascii="Times New Roman" w:hAnsi="Times New Roman" w:cs="Times New Roman" w:eastAsia="Times New Roman"/>
       <w:b/>
       <w:bCs/>
       <w:i/>
@@ -1516,7 +1525,7 @@
     <w:semiHidden/>
     <w:rsid w:val="00FC693F"/>
     <w:rPr>
-      <w:rFonts w:asciiTheme="majorHAnsi" w:eastAsiaTheme="majorEastAsia" w:hAnsiTheme="majorHAnsi" w:cstheme="majorBidi"/>
+      <w:rFonts w:ascii="Times New Roman" w:hAnsi="Times New Roman" w:cs="Times New Roman" w:eastAsia="Times New Roman"/>
       <w:color w:val="243F60" w:themeColor="accent1" w:themeShade="7F"/>
     </w:rPr>
   </w:style>
@@ -1528,7 +1537,7 @@
     <w:semiHidden/>
     <w:rsid w:val="00FC693F"/>
     <w:rPr>
-      <w:rFonts w:asciiTheme="majorHAnsi" w:eastAsiaTheme="majorEastAsia" w:hAnsiTheme="majorHAnsi" w:cstheme="majorBidi"/>
+      <w:rFonts w:ascii="Times New Roman" w:hAnsi="Times New Roman" w:cs="Times New Roman" w:eastAsia="Times New Roman"/>
       <w:i/>
       <w:iCs/>
       <w:color w:val="243F60" w:themeColor="accent1" w:themeShade="7F"/>
@@ -1542,7 +1551,7 @@
     <w:semiHidden/>
     <w:rsid w:val="00FC693F"/>
     <w:rPr>
-      <w:rFonts w:asciiTheme="majorHAnsi" w:eastAsiaTheme="majorEastAsia" w:hAnsiTheme="majorHAnsi" w:cstheme="majorBidi"/>
+      <w:rFonts w:ascii="Times New Roman" w:hAnsi="Times New Roman" w:cs="Times New Roman" w:eastAsia="Times New Roman"/>
       <w:i/>
       <w:iCs/>
       <w:color w:val="404040" w:themeColor="text1" w:themeTint="BF"/>
@@ -1556,7 +1565,7 @@
     <w:semiHidden/>
     <w:rsid w:val="00FC693F"/>
     <w:rPr>
-      <w:rFonts w:asciiTheme="majorHAnsi" w:eastAsiaTheme="majorEastAsia" w:hAnsiTheme="majorHAnsi" w:cstheme="majorBidi"/>
+      <w:rFonts w:ascii="Times New Roman" w:hAnsi="Times New Roman" w:cs="Times New Roman" w:eastAsia="Times New Roman"/>
       <w:color w:val="4F81BD" w:themeColor="accent1"/>
       <w:sz w:val="20"/>
       <w:szCs w:val="20"/>
@@ -1570,7 +1579,7 @@
     <w:semiHidden/>
     <w:rsid w:val="00FC693F"/>
     <w:rPr>
-      <w:rFonts w:asciiTheme="majorHAnsi" w:eastAsiaTheme="majorEastAsia" w:hAnsiTheme="majorHAnsi" w:cstheme="majorBidi"/>
+      <w:rFonts w:ascii="Times New Roman" w:hAnsi="Times New Roman" w:cs="Times New Roman" w:eastAsia="Times New Roman"/>
       <w:i/>
       <w:iCs/>
       <w:color w:val="404040" w:themeColor="text1" w:themeTint="BF"/>
@@ -6419,7 +6428,7 @@
       <w:spacing w:after="0" w:line="240" w:lineRule="auto"/>
     </w:pPr>
     <w:rPr>
-      <w:rFonts w:asciiTheme="majorHAnsi" w:eastAsiaTheme="majorEastAsia" w:hAnsiTheme="majorHAnsi" w:cstheme="majorBidi"/>
+      <w:rFonts w:ascii="Times New Roman" w:hAnsi="Times New Roman" w:cs="Times New Roman" w:eastAsia="Times New Roman"/>
       <w:color w:val="000000" w:themeColor="text1"/>
     </w:rPr>
     <w:tblPr>
@@ -6547,7 +6556,7 @@
       <w:spacing w:after="0" w:line="240" w:lineRule="auto"/>
     </w:pPr>
     <w:rPr>
-      <w:rFonts w:asciiTheme="majorHAnsi" w:eastAsiaTheme="majorEastAsia" w:hAnsiTheme="majorHAnsi" w:cstheme="majorBidi"/>
+      <w:rFonts w:ascii="Times New Roman" w:hAnsi="Times New Roman" w:cs="Times New Roman" w:eastAsia="Times New Roman"/>
       <w:color w:val="000000" w:themeColor="text1"/>
     </w:rPr>
     <w:tblPr>
@@ -6675,7 +6684,7 @@
       <w:spacing w:after="0" w:line="240" w:lineRule="auto"/>
     </w:pPr>
     <w:rPr>
-      <w:rFonts w:asciiTheme="majorHAnsi" w:eastAsiaTheme="majorEastAsia" w:hAnsiTheme="majorHAnsi" w:cstheme="majorBidi"/>
+      <w:rFonts w:ascii="Times New Roman" w:hAnsi="Times New Roman" w:cs="Times New Roman" w:eastAsia="Times New Roman"/>
       <w:color w:val="000000" w:themeColor="text1"/>
     </w:rPr>
     <w:tblPr>
@@ -6803,7 +6812,7 @@
       <w:spacing w:after="0" w:line="240" w:lineRule="auto"/>
     </w:pPr>
     <w:rPr>
-      <w:rFonts w:asciiTheme="majorHAnsi" w:eastAsiaTheme="majorEastAsia" w:hAnsiTheme="majorHAnsi" w:cstheme="majorBidi"/>
+      <w:rFonts w:ascii="Times New Roman" w:hAnsi="Times New Roman" w:cs="Times New Roman" w:eastAsia="Times New Roman"/>
       <w:color w:val="000000" w:themeColor="text1"/>
     </w:rPr>
     <w:tblPr>
@@ -6931,7 +6940,7 @@
       <w:spacing w:after="0" w:line="240" w:lineRule="auto"/>
     </w:pPr>
     <w:rPr>
-      <w:rFonts w:asciiTheme="majorHAnsi" w:eastAsiaTheme="majorEastAsia" w:hAnsiTheme="majorHAnsi" w:cstheme="majorBidi"/>
+      <w:rFonts w:ascii="Times New Roman" w:hAnsi="Times New Roman" w:cs="Times New Roman" w:eastAsia="Times New Roman"/>
       <w:color w:val="000000" w:themeColor="text1"/>
     </w:rPr>
     <w:tblPr>
@@ -7059,7 +7068,7 @@
       <w:spacing w:after="0" w:line="240" w:lineRule="auto"/>
     </w:pPr>
     <w:rPr>
-      <w:rFonts w:asciiTheme="majorHAnsi" w:eastAsiaTheme="majorEastAsia" w:hAnsiTheme="majorHAnsi" w:cstheme="majorBidi"/>
+      <w:rFonts w:ascii="Times New Roman" w:hAnsi="Times New Roman" w:cs="Times New Roman" w:eastAsia="Times New Roman"/>
       <w:color w:val="000000" w:themeColor="text1"/>
     </w:rPr>
     <w:tblPr>
@@ -7187,7 +7196,7 @@
       <w:spacing w:after="0" w:line="240" w:lineRule="auto"/>
     </w:pPr>
     <w:rPr>
-      <w:rFonts w:asciiTheme="majorHAnsi" w:eastAsiaTheme="majorEastAsia" w:hAnsiTheme="majorHAnsi" w:cstheme="majorBidi"/>
+      <w:rFonts w:ascii="Times New Roman" w:hAnsi="Times New Roman" w:cs="Times New Roman" w:eastAsia="Times New Roman"/>
       <w:color w:val="000000" w:themeColor="text1"/>
     </w:rPr>
     <w:tblPr>
@@ -7826,7 +7835,7 @@
       <w:spacing w:after="0" w:line="240" w:lineRule="auto"/>
     </w:pPr>
     <w:rPr>
-      <w:rFonts w:asciiTheme="majorHAnsi" w:eastAsiaTheme="majorEastAsia" w:hAnsiTheme="majorHAnsi" w:cstheme="majorBidi"/>
+      <w:rFonts w:ascii="Times New Roman" w:hAnsi="Times New Roman" w:cs="Times New Roman" w:eastAsia="Times New Roman"/>
       <w:color w:val="000000" w:themeColor="text1"/>
     </w:rPr>
     <w:tblPr>
@@ -7951,7 +7960,7 @@
       <w:spacing w:after="0" w:line="240" w:lineRule="auto"/>
     </w:pPr>
     <w:rPr>
-      <w:rFonts w:asciiTheme="majorHAnsi" w:eastAsiaTheme="majorEastAsia" w:hAnsiTheme="majorHAnsi" w:cstheme="majorBidi"/>
+      <w:rFonts w:ascii="Times New Roman" w:hAnsi="Times New Roman" w:cs="Times New Roman" w:eastAsia="Times New Roman"/>
       <w:color w:val="000000" w:themeColor="text1"/>
     </w:rPr>
     <w:tblPr>
@@ -8076,7 +8085,7 @@
       <w:spacing w:after="0" w:line="240" w:lineRule="auto"/>
     </w:pPr>
     <w:rPr>
-      <w:rFonts w:asciiTheme="majorHAnsi" w:eastAsiaTheme="majorEastAsia" w:hAnsiTheme="majorHAnsi" w:cstheme="majorBidi"/>
+      <w:rFonts w:ascii="Times New Roman" w:hAnsi="Times New Roman" w:cs="Times New Roman" w:eastAsia="Times New Roman"/>
       <w:color w:val="000000" w:themeColor="text1"/>
     </w:rPr>
     <w:tblPr>
@@ -8201,7 +8210,7 @@
       <w:spacing w:after="0" w:line="240" w:lineRule="auto"/>
     </w:pPr>
     <w:rPr>
-      <w:rFonts w:asciiTheme="majorHAnsi" w:eastAsiaTheme="majorEastAsia" w:hAnsiTheme="majorHAnsi" w:cstheme="majorBidi"/>
+      <w:rFonts w:ascii="Times New Roman" w:hAnsi="Times New Roman" w:cs="Times New Roman" w:eastAsia="Times New Roman"/>
       <w:color w:val="000000" w:themeColor="text1"/>
     </w:rPr>
     <w:tblPr>
@@ -8326,7 +8335,7 @@
       <w:spacing w:after="0" w:line="240" w:lineRule="auto"/>
     </w:pPr>
     <w:rPr>
-      <w:rFonts w:asciiTheme="majorHAnsi" w:eastAsiaTheme="majorEastAsia" w:hAnsiTheme="majorHAnsi" w:cstheme="majorBidi"/>
+      <w:rFonts w:ascii="Times New Roman" w:hAnsi="Times New Roman" w:cs="Times New Roman" w:eastAsia="Times New Roman"/>
       <w:color w:val="000000" w:themeColor="text1"/>
     </w:rPr>
     <w:tblPr>
@@ -8451,7 +8460,7 @@
       <w:spacing w:after="0" w:line="240" w:lineRule="auto"/>
     </w:pPr>
     <w:rPr>
-      <w:rFonts w:asciiTheme="majorHAnsi" w:eastAsiaTheme="majorEastAsia" w:hAnsiTheme="majorHAnsi" w:cstheme="majorBidi"/>
+      <w:rFonts w:ascii="Times New Roman" w:hAnsi="Times New Roman" w:cs="Times New Roman" w:eastAsia="Times New Roman"/>
       <w:color w:val="000000" w:themeColor="text1"/>
     </w:rPr>
     <w:tblPr>
@@ -8576,7 +8585,7 @@
       <w:spacing w:after="0" w:line="240" w:lineRule="auto"/>
     </w:pPr>
     <w:rPr>
-      <w:rFonts w:asciiTheme="majorHAnsi" w:eastAsiaTheme="majorEastAsia" w:hAnsiTheme="majorHAnsi" w:cstheme="majorBidi"/>
+      <w:rFonts w:ascii="Times New Roman" w:hAnsi="Times New Roman" w:cs="Times New Roman" w:eastAsia="Times New Roman"/>
       <w:color w:val="000000" w:themeColor="text1"/>
     </w:rPr>
     <w:tblPr>
@@ -12491,9 +12500,9 @@
   <w:docDefaults>
     <w:rPrDefault>
       <w:rPr>
-        <w:rFonts w:asciiTheme="minorHAnsi" w:eastAsiaTheme="minorEastAsia" w:hAnsiTheme="minorHAnsi" w:cstheme="minorBidi"/>
-        <w:sz w:val="22"/>
-        <w:szCs w:val="22"/>
+        <w:rFonts w:ascii="Times New Roman" w:hAnsi="Times New Roman" w:cs="Times New Roman" w:eastAsia="Times New Roman"/>
+        <w:sz w:val="26"/>
+        <w:szCs w:val="26"/>
         <w:lang w:val="en-US" w:eastAsia="en-US" w:bidi="ar-SA"/>
       </w:rPr>
     </w:rPrDefault>
@@ -12646,6 +12655,11 @@
     <w:name w:val="Normal"/>
     <w:qFormat/>
     <w:rsid w:val="00FC693F"/>
+    <w:rPr>
+      <w:rFonts w:ascii="Times New Roman" w:hAnsi="Times New Roman" w:cs="Times New Roman" w:eastAsia="Times New Roman"/>
+      <w:sz w:val="26"/>
+      <w:szCs w:val="26"/>
+    </w:rPr>
   </w:style>
   <w:style w:type="paragraph" w:styleId="Heading1">
     <w:name w:val="heading 1"/>
@@ -12662,12 +12676,13 @@
       <w:outlineLvl w:val="0"/>
     </w:pPr>
     <w:rPr>
-      <w:rFonts w:asciiTheme="majorHAnsi" w:eastAsiaTheme="majorEastAsia" w:hAnsiTheme="majorHAnsi" w:cstheme="majorBidi"/>
+      <w:rFonts w:ascii="Times New Roman" w:hAnsi="Times New Roman" w:cs="Times New Roman" w:eastAsia="Times New Roman"/>
       <w:b/>
       <w:bCs/>
       <w:color w:val="365F91" w:themeColor="accent1" w:themeShade="BF"/>
       <w:sz w:val="28"/>
       <w:szCs w:val="28"/>
+      <w:caps/>
     </w:rPr>
   </w:style>
   <w:style w:type="paragraph" w:styleId="Heading2">
@@ -12686,12 +12701,13 @@
       <w:outlineLvl w:val="1"/>
     </w:pPr>
     <w:rPr>
-      <w:rFonts w:asciiTheme="majorHAnsi" w:eastAsiaTheme="majorEastAsia" w:hAnsiTheme="majorHAnsi" w:cstheme="majorBidi"/>
+      <w:rFonts w:ascii="Times New Roman" w:hAnsi="Times New Roman" w:cs="Times New Roman" w:eastAsia="Times New Roman"/>
       <w:b/>
       <w:bCs/>
       <w:color w:val="4F81BD" w:themeColor="accent1"/>
-      <w:sz w:val="26"/>
-      <w:szCs w:val="26"/>
+      <w:sz w:val="28"/>
+      <w:szCs w:val="28"/>
+      <w:caps/>
     </w:rPr>
   </w:style>
   <w:style w:type="paragraph" w:styleId="Heading3">
@@ -12710,7 +12726,7 @@
       <w:outlineLvl w:val="2"/>
     </w:pPr>
     <w:rPr>
-      <w:rFonts w:asciiTheme="majorHAnsi" w:eastAsiaTheme="majorEastAsia" w:hAnsiTheme="majorHAnsi" w:cstheme="majorBidi"/>
+      <w:rFonts w:ascii="Times New Roman" w:hAnsi="Times New Roman" w:cs="Times New Roman" w:eastAsia="Times New Roman"/>
       <w:b/>
       <w:bCs/>
       <w:color w:val="4F81BD" w:themeColor="accent1"/>
@@ -12733,7 +12749,7 @@
       <w:outlineLvl w:val="3"/>
     </w:pPr>
     <w:rPr>
-      <w:rFonts w:asciiTheme="majorHAnsi" w:eastAsiaTheme="majorEastAsia" w:hAnsiTheme="majorHAnsi" w:cstheme="majorBidi"/>
+      <w:rFonts w:ascii="Times New Roman" w:hAnsi="Times New Roman" w:cs="Times New Roman" w:eastAsia="Times New Roman"/>
       <w:b/>
       <w:bCs/>
       <w:i/>
@@ -12758,7 +12774,7 @@
       <w:outlineLvl w:val="4"/>
     </w:pPr>
     <w:rPr>
-      <w:rFonts w:asciiTheme="majorHAnsi" w:eastAsiaTheme="majorEastAsia" w:hAnsiTheme="majorHAnsi" w:cstheme="majorBidi"/>
+      <w:rFonts w:ascii="Times New Roman" w:hAnsi="Times New Roman" w:cs="Times New Roman" w:eastAsia="Times New Roman"/>
       <w:color w:val="243F60" w:themeColor="accent1" w:themeShade="7F"/>
     </w:rPr>
   </w:style>
@@ -12779,7 +12795,7 @@
       <w:outlineLvl w:val="5"/>
     </w:pPr>
     <w:rPr>
-      <w:rFonts w:asciiTheme="majorHAnsi" w:eastAsiaTheme="majorEastAsia" w:hAnsiTheme="majorHAnsi" w:cstheme="majorBidi"/>
+      <w:rFonts w:ascii="Times New Roman" w:hAnsi="Times New Roman" w:cs="Times New Roman" w:eastAsia="Times New Roman"/>
       <w:i/>
       <w:iCs/>
       <w:color w:val="243F60" w:themeColor="accent1" w:themeShade="7F"/>
@@ -12802,7 +12818,7 @@
       <w:outlineLvl w:val="6"/>
     </w:pPr>
     <w:rPr>
-      <w:rFonts w:asciiTheme="majorHAnsi" w:eastAsiaTheme="majorEastAsia" w:hAnsiTheme="majorHAnsi" w:cstheme="majorBidi"/>
+      <w:rFonts w:ascii="Times New Roman" w:hAnsi="Times New Roman" w:cs="Times New Roman" w:eastAsia="Times New Roman"/>
       <w:i/>
       <w:iCs/>
       <w:color w:val="404040" w:themeColor="text1" w:themeTint="BF"/>
@@ -12825,7 +12841,7 @@
       <w:outlineLvl w:val="7"/>
     </w:pPr>
     <w:rPr>
-      <w:rFonts w:asciiTheme="majorHAnsi" w:eastAsiaTheme="majorEastAsia" w:hAnsiTheme="majorHAnsi" w:cstheme="majorBidi"/>
+      <w:rFonts w:ascii="Times New Roman" w:hAnsi="Times New Roman" w:cs="Times New Roman" w:eastAsia="Times New Roman"/>
       <w:color w:val="4F81BD" w:themeColor="accent1"/>
       <w:sz w:val="20"/>
       <w:szCs w:val="20"/>
@@ -12848,7 +12864,7 @@
       <w:outlineLvl w:val="8"/>
     </w:pPr>
     <w:rPr>
-      <w:rFonts w:asciiTheme="majorHAnsi" w:eastAsiaTheme="majorEastAsia" w:hAnsiTheme="majorHAnsi" w:cstheme="majorBidi"/>
+      <w:rFonts w:ascii="Times New Roman" w:hAnsi="Times New Roman" w:cs="Times New Roman" w:eastAsia="Times New Roman"/>
       <w:i/>
       <w:iCs/>
       <w:color w:val="404040" w:themeColor="text1" w:themeTint="BF"/>
@@ -12899,7 +12915,7 @@
     <w:uiPriority w:val="9"/>
     <w:rsid w:val="00FC693F"/>
     <w:rPr>
-      <w:rFonts w:asciiTheme="majorHAnsi" w:eastAsiaTheme="majorEastAsia" w:hAnsiTheme="majorHAnsi" w:cstheme="majorBidi"/>
+      <w:rFonts w:ascii="Times New Roman" w:hAnsi="Times New Roman" w:cs="Times New Roman" w:eastAsia="Times New Roman"/>
       <w:b/>
       <w:bCs/>
       <w:color w:val="365F91" w:themeColor="accent1" w:themeShade="BF"/>
@@ -12914,7 +12930,7 @@
     <w:uiPriority w:val="9"/>
     <w:rsid w:val="00FC693F"/>
     <w:rPr>
-      <w:rFonts w:asciiTheme="majorHAnsi" w:eastAsiaTheme="majorEastAsia" w:hAnsiTheme="majorHAnsi" w:cstheme="majorBidi"/>
+      <w:rFonts w:ascii="Times New Roman" w:hAnsi="Times New Roman" w:cs="Times New Roman" w:eastAsia="Times New Roman"/>
       <w:b/>
       <w:bCs/>
       <w:color w:val="4F81BD" w:themeColor="accent1"/>
@@ -12929,7 +12945,7 @@
     <w:uiPriority w:val="9"/>
     <w:rsid w:val="00FC693F"/>
     <w:rPr>
-      <w:rFonts w:asciiTheme="majorHAnsi" w:eastAsiaTheme="majorEastAsia" w:hAnsiTheme="majorHAnsi" w:cstheme="majorBidi"/>
+      <w:rFonts w:ascii="Times New Roman" w:hAnsi="Times New Roman" w:cs="Times New Roman" w:eastAsia="Times New Roman"/>
       <w:b/>
       <w:bCs/>
       <w:color w:val="4F81BD" w:themeColor="accent1"/>
@@ -12951,12 +12967,15 @@
       <w:contextualSpacing/>
     </w:pPr>
     <w:rPr>
-      <w:rFonts w:asciiTheme="majorHAnsi" w:eastAsiaTheme="majorEastAsia" w:hAnsiTheme="majorHAnsi" w:cstheme="majorBidi"/>
+      <w:rFonts w:ascii="Times New Roman" w:hAnsi="Times New Roman" w:cs="Times New Roman" w:eastAsia="Times New Roman"/>
       <w:color w:val="17365D" w:themeColor="text2" w:themeShade="BF"/>
       <w:spacing w:val="5"/>
       <w:kern w:val="28"/>
-      <w:sz w:val="52"/>
-      <w:szCs w:val="52"/>
+      <w:sz w:val="28"/>
+      <w:szCs w:val="28"/>
+      <w:b/>
+      <w:bCs/>
+      <w:caps/>
     </w:rPr>
   </w:style>
   <w:style w:type="character" w:customStyle="1" w:styleId="TitleChar">
@@ -12966,7 +12985,7 @@
     <w:uiPriority w:val="10"/>
     <w:rsid w:val="00FC693F"/>
     <w:rPr>
-      <w:rFonts w:asciiTheme="majorHAnsi" w:eastAsiaTheme="majorEastAsia" w:hAnsiTheme="majorHAnsi" w:cstheme="majorBidi"/>
+      <w:rFonts w:ascii="Times New Roman" w:hAnsi="Times New Roman" w:cs="Times New Roman" w:eastAsia="Times New Roman"/>
       <w:color w:val="17365D" w:themeColor="text2" w:themeShade="BF"/>
       <w:spacing w:val="5"/>
       <w:kern w:val="28"/>
@@ -12988,7 +13007,7 @@
       </w:numPr>
     </w:pPr>
     <w:rPr>
-      <w:rFonts w:asciiTheme="majorHAnsi" w:eastAsiaTheme="majorEastAsia" w:hAnsiTheme="majorHAnsi" w:cstheme="majorBidi"/>
+      <w:rFonts w:ascii="Times New Roman" w:hAnsi="Times New Roman" w:cs="Times New Roman" w:eastAsia="Times New Roman"/>
       <w:i/>
       <w:iCs/>
       <w:color w:val="4F81BD" w:themeColor="accent1"/>
@@ -13004,7 +13023,7 @@
     <w:uiPriority w:val="11"/>
     <w:rsid w:val="00FC693F"/>
     <w:rPr>
-      <w:rFonts w:asciiTheme="majorHAnsi" w:eastAsiaTheme="majorEastAsia" w:hAnsiTheme="majorHAnsi" w:cstheme="majorBidi"/>
+      <w:rFonts w:ascii="Times New Roman" w:hAnsi="Times New Roman" w:cs="Times New Roman" w:eastAsia="Times New Roman"/>
       <w:i/>
       <w:iCs/>
       <w:color w:val="4F81BD" w:themeColor="accent1"/>
@@ -13131,6 +13150,11 @@
       </w:numPr>
       <w:contextualSpacing/>
     </w:pPr>
+    <w:rPr>
+      <w:rFonts w:ascii="Times New Roman" w:hAnsi="Times New Roman" w:cs="Times New Roman" w:eastAsia="Times New Roman"/>
+      <w:sz w:val="26"/>
+      <w:szCs w:val="26"/>
+    </w:rPr>
   </w:style>
   <w:style w:type="paragraph" w:styleId="ListBullet2">
     <w:name w:val="List Bullet 2"/>
@@ -13251,7 +13275,7 @@
       </w:tabs>
     </w:pPr>
     <w:rPr>
-      <w:rFonts w:ascii="Courier" w:hAnsi="Courier"/>
+      <w:rFonts w:ascii="Times New Roman" w:hAnsi="Times New Roman" w:cs="Times New Roman" w:eastAsia="Times New Roman"/>
       <w:sz w:val="20"/>
       <w:szCs w:val="20"/>
     </w:rPr>
@@ -13263,7 +13287,7 @@
     <w:uiPriority w:val="99"/>
     <w:rsid w:val="0029639D"/>
     <w:rPr>
-      <w:rFonts w:ascii="Courier" w:hAnsi="Courier"/>
+      <w:rFonts w:ascii="Times New Roman" w:hAnsi="Times New Roman" w:cs="Times New Roman" w:eastAsia="Times New Roman"/>
       <w:sz w:val="20"/>
       <w:szCs w:val="20"/>
     </w:rPr>
@@ -13302,7 +13326,7 @@
     <w:semiHidden/>
     <w:rsid w:val="00FC693F"/>
     <w:rPr>
-      <w:rFonts w:asciiTheme="majorHAnsi" w:eastAsiaTheme="majorEastAsia" w:hAnsiTheme="majorHAnsi" w:cstheme="majorBidi"/>
+      <w:rFonts w:ascii="Times New Roman" w:hAnsi="Times New Roman" w:cs="Times New Roman" w:eastAsia="Times New Roman"/>
       <w:b/>
       <w:bCs/>
       <w:i/>
@@ -13318,7 +13342,7 @@
     <w:semiHidden/>
     <w:rsid w:val="00FC693F"/>
     <w:rPr>
-      <w:rFonts w:asciiTheme="majorHAnsi" w:eastAsiaTheme="majorEastAsia" w:hAnsiTheme="majorHAnsi" w:cstheme="majorBidi"/>
+      <w:rFonts w:ascii="Times New Roman" w:hAnsi="Times New Roman" w:cs="Times New Roman" w:eastAsia="Times New Roman"/>
       <w:color w:val="243F60" w:themeColor="accent1" w:themeShade="7F"/>
     </w:rPr>
   </w:style>
@@ -13330,7 +13354,7 @@
     <w:semiHidden/>
     <w:rsid w:val="00FC693F"/>
     <w:rPr>
-      <w:rFonts w:asciiTheme="majorHAnsi" w:eastAsiaTheme="majorEastAsia" w:hAnsiTheme="majorHAnsi" w:cstheme="majorBidi"/>
+      <w:rFonts w:ascii="Times New Roman" w:hAnsi="Times New Roman" w:cs="Times New Roman" w:eastAsia="Times New Roman"/>
       <w:i/>
       <w:iCs/>
       <w:color w:val="243F60" w:themeColor="accent1" w:themeShade="7F"/>
@@ -13344,7 +13368,7 @@
     <w:semiHidden/>
     <w:rsid w:val="00FC693F"/>
     <w:rPr>
-      <w:rFonts w:asciiTheme="majorHAnsi" w:eastAsiaTheme="majorEastAsia" w:hAnsiTheme="majorHAnsi" w:cstheme="majorBidi"/>
+      <w:rFonts w:ascii="Times New Roman" w:hAnsi="Times New Roman" w:cs="Times New Roman" w:eastAsia="Times New Roman"/>
       <w:i/>
       <w:iCs/>
       <w:color w:val="404040" w:themeColor="text1" w:themeTint="BF"/>
@@ -13358,7 +13382,7 @@
     <w:semiHidden/>
     <w:rsid w:val="00FC693F"/>
     <w:rPr>
-      <w:rFonts w:asciiTheme="majorHAnsi" w:eastAsiaTheme="majorEastAsia" w:hAnsiTheme="majorHAnsi" w:cstheme="majorBidi"/>
+      <w:rFonts w:ascii="Times New Roman" w:hAnsi="Times New Roman" w:cs="Times New Roman" w:eastAsia="Times New Roman"/>
       <w:color w:val="4F81BD" w:themeColor="accent1"/>
       <w:sz w:val="20"/>
       <w:szCs w:val="20"/>
@@ -13372,7 +13396,7 @@
     <w:semiHidden/>
     <w:rsid w:val="00FC693F"/>
     <w:rPr>
-      <w:rFonts w:asciiTheme="majorHAnsi" w:eastAsiaTheme="majorEastAsia" w:hAnsiTheme="majorHAnsi" w:cstheme="majorBidi"/>
+      <w:rFonts w:ascii="Times New Roman" w:hAnsi="Times New Roman" w:cs="Times New Roman" w:eastAsia="Times New Roman"/>
       <w:i/>
       <w:iCs/>
       <w:color w:val="404040" w:themeColor="text1" w:themeTint="BF"/>
@@ -18221,7 +18245,7 @@
       <w:spacing w:after="0" w:line="240" w:lineRule="auto"/>
     </w:pPr>
     <w:rPr>
-      <w:rFonts w:asciiTheme="majorHAnsi" w:eastAsiaTheme="majorEastAsia" w:hAnsiTheme="majorHAnsi" w:cstheme="majorBidi"/>
+      <w:rFonts w:ascii="Times New Roman" w:hAnsi="Times New Roman" w:cs="Times New Roman" w:eastAsia="Times New Roman"/>
       <w:color w:val="000000" w:themeColor="text1"/>
     </w:rPr>
     <w:tblPr>
@@ -18349,7 +18373,7 @@
       <w:spacing w:after="0" w:line="240" w:lineRule="auto"/>
     </w:pPr>
     <w:rPr>
-      <w:rFonts w:asciiTheme="majorHAnsi" w:eastAsiaTheme="majorEastAsia" w:hAnsiTheme="majorHAnsi" w:cstheme="majorBidi"/>
+      <w:rFonts w:ascii="Times New Roman" w:hAnsi="Times New Roman" w:cs="Times New Roman" w:eastAsia="Times New Roman"/>
       <w:color w:val="000000" w:themeColor="text1"/>
     </w:rPr>
     <w:tblPr>
@@ -18477,7 +18501,7 @@
       <w:spacing w:after="0" w:line="240" w:lineRule="auto"/>
     </w:pPr>
     <w:rPr>
-      <w:rFonts w:asciiTheme="majorHAnsi" w:eastAsiaTheme="majorEastAsia" w:hAnsiTheme="majorHAnsi" w:cstheme="majorBidi"/>
+      <w:rFonts w:ascii="Times New Roman" w:hAnsi="Times New Roman" w:cs="Times New Roman" w:eastAsia="Times New Roman"/>
       <w:color w:val="000000" w:themeColor="text1"/>
     </w:rPr>
     <w:tblPr>
@@ -18605,7 +18629,7 @@
       <w:spacing w:after="0" w:line="240" w:lineRule="auto"/>
     </w:pPr>
     <w:rPr>
-      <w:rFonts w:asciiTheme="majorHAnsi" w:eastAsiaTheme="majorEastAsia" w:hAnsiTheme="majorHAnsi" w:cstheme="majorBidi"/>
+      <w:rFonts w:ascii="Times New Roman" w:hAnsi="Times New Roman" w:cs="Times New Roman" w:eastAsia="Times New Roman"/>
       <w:color w:val="000000" w:themeColor="text1"/>
     </w:rPr>
     <w:tblPr>
@@ -18733,7 +18757,7 @@
       <w:spacing w:after="0" w:line="240" w:lineRule="auto"/>
     </w:pPr>
     <w:rPr>
-      <w:rFonts w:asciiTheme="majorHAnsi" w:eastAsiaTheme="majorEastAsia" w:hAnsiTheme="majorHAnsi" w:cstheme="majorBidi"/>
+      <w:rFonts w:ascii="Times New Roman" w:hAnsi="Times New Roman" w:cs="Times New Roman" w:eastAsia="Times New Roman"/>
       <w:color w:val="000000" w:themeColor="text1"/>
     </w:rPr>
     <w:tblPr>
@@ -18861,7 +18885,7 @@
       <w:spacing w:after="0" w:line="240" w:lineRule="auto"/>
     </w:pPr>
     <w:rPr>
-      <w:rFonts w:asciiTheme="majorHAnsi" w:eastAsiaTheme="majorEastAsia" w:hAnsiTheme="majorHAnsi" w:cstheme="majorBidi"/>
+      <w:rFonts w:ascii="Times New Roman" w:hAnsi="Times New Roman" w:cs="Times New Roman" w:eastAsia="Times New Roman"/>
       <w:color w:val="000000" w:themeColor="text1"/>
     </w:rPr>
     <w:tblPr>
@@ -18989,7 +19013,7 @@
       <w:spacing w:after="0" w:line="240" w:lineRule="auto"/>
     </w:pPr>
     <w:rPr>
-      <w:rFonts w:asciiTheme="majorHAnsi" w:eastAsiaTheme="majorEastAsia" w:hAnsiTheme="majorHAnsi" w:cstheme="majorBidi"/>
+      <w:rFonts w:ascii="Times New Roman" w:hAnsi="Times New Roman" w:cs="Times New Roman" w:eastAsia="Times New Roman"/>
       <w:color w:val="000000" w:themeColor="text1"/>
     </w:rPr>
     <w:tblPr>
@@ -19628,7 +19652,7 @@
       <w:spacing w:after="0" w:line="240" w:lineRule="auto"/>
     </w:pPr>
     <w:rPr>
-      <w:rFonts w:asciiTheme="majorHAnsi" w:eastAsiaTheme="majorEastAsia" w:hAnsiTheme="majorHAnsi" w:cstheme="majorBidi"/>
+      <w:rFonts w:ascii="Times New Roman" w:hAnsi="Times New Roman" w:cs="Times New Roman" w:eastAsia="Times New Roman"/>
       <w:color w:val="000000" w:themeColor="text1"/>
     </w:rPr>
     <w:tblPr>
@@ -19753,7 +19777,7 @@
       <w:spacing w:after="0" w:line="240" w:lineRule="auto"/>
     </w:pPr>
     <w:rPr>
-      <w:rFonts w:asciiTheme="majorHAnsi" w:eastAsiaTheme="majorEastAsia" w:hAnsiTheme="majorHAnsi" w:cstheme="majorBidi"/>
+      <w:rFonts w:ascii="Times New Roman" w:hAnsi="Times New Roman" w:cs="Times New Roman" w:eastAsia="Times New Roman"/>
       <w:color w:val="000000" w:themeColor="text1"/>
     </w:rPr>
     <w:tblPr>
@@ -19878,7 +19902,7 @@
       <w:spacing w:after="0" w:line="240" w:lineRule="auto"/>
     </w:pPr>
     <w:rPr>
-      <w:rFonts w:asciiTheme="majorHAnsi" w:eastAsiaTheme="majorEastAsia" w:hAnsiTheme="majorHAnsi" w:cstheme="majorBidi"/>
+      <w:rFonts w:ascii="Times New Roman" w:hAnsi="Times New Roman" w:cs="Times New Roman" w:eastAsia="Times New Roman"/>
       <w:color w:val="000000" w:themeColor="text1"/>
     </w:rPr>
     <w:tblPr>
@@ -20003,7 +20027,7 @@
       <w:spacing w:after="0" w:line="240" w:lineRule="auto"/>
     </w:pPr>
     <w:rPr>
-      <w:rFonts w:asciiTheme="majorHAnsi" w:eastAsiaTheme="majorEastAsia" w:hAnsiTheme="majorHAnsi" w:cstheme="majorBidi"/>
+      <w:rFonts w:ascii="Times New Roman" w:hAnsi="Times New Roman" w:cs="Times New Roman" w:eastAsia="Times New Roman"/>
       <w:color w:val="000000" w:themeColor="text1"/>
     </w:rPr>
     <w:tblPr>
@@ -20128,7 +20152,7 @@
       <w:spacing w:after="0" w:line="240" w:lineRule="auto"/>
     </w:pPr>
     <w:rPr>
-      <w:rFonts w:asciiTheme="majorHAnsi" w:eastAsiaTheme="majorEastAsia" w:hAnsiTheme="majorHAnsi" w:cstheme="majorBidi"/>
+      <w:rFonts w:ascii="Times New Roman" w:hAnsi="Times New Roman" w:cs="Times New Roman" w:eastAsia="Times New Roman"/>
       <w:color w:val="000000" w:themeColor="text1"/>
     </w:rPr>
     <w:tblPr>
@@ -20253,7 +20277,7 @@
       <w:spacing w:after="0" w:line="240" w:lineRule="auto"/>
     </w:pPr>
     <w:rPr>
-      <w:rFonts w:asciiTheme="majorHAnsi" w:eastAsiaTheme="majorEastAsia" w:hAnsiTheme="majorHAnsi" w:cstheme="majorBidi"/>
+      <w:rFonts w:ascii="Times New Roman" w:hAnsi="Times New Roman" w:cs="Times New Roman" w:eastAsia="Times New Roman"/>
       <w:color w:val="000000" w:themeColor="text1"/>
     </w:rPr>
     <w:tblPr>
@@ -20378,7 +20402,7 @@
       <w:spacing w:after="0" w:line="240" w:lineRule="auto"/>
     </w:pPr>
     <w:rPr>
-      <w:rFonts w:asciiTheme="majorHAnsi" w:eastAsiaTheme="majorEastAsia" w:hAnsiTheme="majorHAnsi" w:cstheme="majorBidi"/>
+      <w:rFonts w:ascii="Times New Roman" w:hAnsi="Times New Roman" w:cs="Times New Roman" w:eastAsia="Times New Roman"/>
       <w:color w:val="000000" w:themeColor="text1"/>
     </w:rPr>
     <w:tblPr>
@@ -24331,7 +24355,7 @@
     </a:clrScheme>
     <a:fontScheme name="Office">
       <a:majorFont>
-        <a:latin typeface="Calibri"/>
+        <a:latin typeface="Times New Roman"/>
         <a:ea typeface=""/>
         <a:cs typeface=""/>
         <a:font script="Jpan" typeface="ＭＳ ゴシック"/>
@@ -24366,7 +24390,7 @@
         <a:font script="Geor" typeface="Sylfaen"/>
       </a:majorFont>
       <a:minorFont>
-        <a:latin typeface="Cambria"/>
+        <a:latin typeface="Times New Roman"/>
         <a:ea typeface=""/>
         <a:cs typeface=""/>
         <a:font script="Jpan" typeface="ＭＳ 明朝"/>
@@ -24396,7 +24420,7 @@
         <a:font script="Laoo" typeface="DokChampa"/>
         <a:font script="Sinh" typeface="Iskoola Pota"/>
         <a:font script="Mong" typeface="Mongolian Baiti"/>
-        <a:font script="Viet" typeface="Arial"/>
+        <a:font script="Viet" typeface="Times New Roman"/>
         <a:font script="Uigh" typeface="Microsoft Uighur"/>
         <a:font script="Geor" typeface="Sylfaen"/>
       </a:minorFont>

</xml_diff>

<commit_message>
chore: update handover docs and clean repository artifacts
</commit_message>
<xml_diff>
--- a/docs/handover/word/BACKLOG.docx
+++ b/docs/handover/word/BACKLOG.docx
@@ -7,7 +7,7 @@
         <w:pStyle w:val="Title"/>
       </w:pPr>
       <w:r>
-        <w:t>KẾ HOẠCH PHÁT TRIỂN TIẾP THEO CỦA ITAM</w:t>
+        <w:t>Kế hoạch phát triển tiếp theo của ITAM</w:t>
       </w:r>
     </w:p>
     <w:p>
@@ -20,7 +20,7 @@
         <w:pStyle w:val="Heading1"/>
       </w:pPr>
       <w:r>
-        <w:t>NGUYÊN TẮC LỰA CHỌN</w:t>
+        <w:t>Nguyên tắc lựa chọn</w:t>
       </w:r>
     </w:p>
     <w:p>
@@ -33,7 +33,66 @@
         <w:pStyle w:val="Heading1"/>
       </w:pPr>
       <w:r>
-        <w:t>ƯU TIÊN 1 NGHIỆM THU MÔI TRƯỜNG BÀN GIAO</w:t>
+        <w:t>Ưu tiên 1 Nghiệm thu môi trường bàn giao</w:t>
+      </w:r>
+    </w:p>
+    <w:p>
+      <w:r>
+        <w:t xml:space="preserve">Ngày 25/09/2026 đã chạy regression, migration mới, demo luồng chính và đối soát PDF/Excel trên máy phát triển; xem </w:t>
+      </w:r>
+      <w:hyperlink r:id="rId10">
+        <w:r>
+          <w:rPr>
+            <w:color w:val="0563C1"/>
+          </w:rPr>
+          <w:t>BIEN_BAN_BAN_GIAO.docx</w:t>
+        </w:r>
+      </w:hyperlink>
+      <w:r>
+        <w:t>. Phần còn lại là chạy trên máy người nhận, kiểm tra các nhánh UI chưa thực hiện, render/rà từng trang Word và điền người nhận/người xác nhận. Không coi thiếu nghiệm thu là chưa có các chức năng T10–T18.</w:t>
+      </w:r>
+    </w:p>
+    <w:p>
+      <w:pPr>
+        <w:pStyle w:val="Heading2"/>
+      </w:pPr>
+      <w:r>
+        <w:t>H01 Lịch sử thu hồi không tải phiếu đã lưu</w:t>
+      </w:r>
+    </w:p>
+    <w:p>
+      <w:r>
+        <w:t xml:space="preserve">Lỗi đã tái hiện ngày 25/09/2026; cần sửa trước nghiệm thu đầy đủ. Tệp liên quan: </w:t>
+      </w:r>
+      <w:r>
+        <w:rPr>
+          <w:rFonts w:ascii="Consolas" w:hAnsi="Consolas"/>
+          <w:sz w:val="18"/>
+        </w:rPr>
+        <w:t>frontend/src/features/recovery/pages/RecoveriesPage.tsx</w:t>
+      </w:r>
+      <w:r>
+        <w:t xml:space="preserve"> và API client thu hồi/giao dịch. Trang hiện dùng </w:t>
+      </w:r>
+      <w:r>
+        <w:rPr>
+          <w:rFonts w:ascii="Consolas" w:hAnsi="Consolas"/>
+          <w:sz w:val="18"/>
+        </w:rPr>
+        <w:t>useState&lt;Recovery[]&gt;([])</w:t>
+      </w:r>
+      <w:r>
+        <w:t>, chỉ thêm phiếu mới hoàn tất trong phiên trang; mở lại trang báo không có lịch sử dù database còn phiếu. Phiếu RC-F5B0572E vẫn xem được ở Chứng từ và tải PDF được.</w:t>
+      </w:r>
+    </w:p>
+    <w:p>
+      <w:r>
+        <w:t>Hành động ưu tiên: dùng API giao dịch để tải lịch sử RECOVERY có phân trang và trạng thái tải/lỗi; giữ nguyên snapshot nghiệp vụ, không tạo bản sao lịch sử bằng localStorage. Tái sử dụng API đọc đã có khi phù hợp, bổ sung endpoint chi tiết chỉ nếu giao diện thực sự cần và nguồn hiện tại chưa đáp ứng.</w:t>
+      </w:r>
+    </w:p>
+    <w:p>
+      <w:r>
+        <w:t>Kiểm tra/tiêu chí chấp nhận: tạo một phiếu bằng IT, reload và đăng nhập lại; ADMIN và IT vẫn tìm thấy cùng mã phiếu, mở đúng PDF, không nhân bản dòng; USER/PUR không được mở lịch sử thu hồi ngoài quyền. Có test hồi quy cho lần mount mới và trạng thái API lỗi. Chưa triển khai sửa trong đợt chuẩn bị tài liệu.</w:t>
       </w:r>
     </w:p>
     <w:p>
@@ -78,7 +137,12 @@
         <w:pStyle w:val="Heading1"/>
       </w:pPr>
       <w:r>
-        <w:t>ƯU TIÊN 1 CHUẨN HÓA BỘ DỮ LIỆU DEMO</w:t>
+        <w:t>Ưu tiên 1 Chuẩn hóa bộ dữ liệu demo</w:t>
+      </w:r>
+    </w:p>
+    <w:p>
+      <w:r>
+        <w:t>Đã tạo bộ dữ liệu giả lập cùng snapshot database/storage sau demo và thử phục hồi database thành công. Chưa có seed tự động toàn bộ dữ liệu nghiệp vụ trước demo; cài mới vẫn cần tạo danh mục/tài sản theo hướng dẫn. Bộ snapshot local không được tự đưa vào Git hoặc coi là dữ liệu seed của migration.</w:t>
       </w:r>
     </w:p>
     <w:p>
@@ -91,7 +155,18 @@
         <w:pStyle w:val="ListBullet"/>
       </w:pPr>
       <w:r>
-        <w:t>Chốt bộ danh mục, tài sản, license và chứng từ giả lập theo DU_LIEU_MAU.docx.</w:t>
+        <w:t xml:space="preserve">Chốt bộ danh mục, tài sản, license và chứng từ giả lập theo </w:t>
+      </w:r>
+      <w:hyperlink r:id="rId11">
+        <w:r>
+          <w:rPr>
+            <w:color w:val="0563C1"/>
+          </w:rPr>
+          <w:t>DU_LIEU_MAU.docx</w:t>
+        </w:r>
+      </w:hyperlink>
+      <w:r>
+        <w:t>.</w:t>
       </w:r>
     </w:p>
     <w:p>
@@ -123,7 +198,7 @@
         <w:pStyle w:val="Heading1"/>
       </w:pPr>
       <w:r>
-        <w:t>ƯU TIÊN 2 THAY LINH KIỆN TRÊN THIẾT BỊ ĐANG SỬ DỤNG</w:t>
+        <w:t>Ưu tiên 2 Thay linh kiện trên thiết bị đang sử dụng</w:t>
       </w:r>
     </w:p>
     <w:p>
@@ -176,7 +251,7 @@
         <w:pStyle w:val="Heading1"/>
       </w:pPr>
       <w:r>
-        <w:t>ƯU TIÊN 2 HOÀN THIỆN VẬN HÀNH VÀ KIỂM THỬ TỰ ĐỘNG</w:t>
+        <w:t>Ưu tiên 2 Hoàn thiện vận hành và kiểm thử tự động</w:t>
       </w:r>
     </w:p>
     <w:p>
@@ -216,7 +291,7 @@
         <w:pStyle w:val="Heading1"/>
       </w:pPr>
       <w:r>
-        <w:t>TRƯỚC PRODUCTION QUẢN LÝ CHỨNG TỪ THẬT</w:t>
+        <w:t>Trước production Quản lý chứng từ thật</w:t>
       </w:r>
     </w:p>
     <w:p>
@@ -253,7 +328,7 @@
         <w:pStyle w:val="Heading1"/>
       </w:pPr>
       <w:r>
-        <w:t>TRƯỚC PRODUCTION GỬI EMAIL THẬT</w:t>
+        <w:t>Trước production Gửi email thật</w:t>
       </w:r>
     </w:p>
     <w:p>
@@ -293,7 +368,7 @@
         <w:pStyle w:val="Heading1"/>
       </w:pPr>
       <w:r>
-        <w:t>TRƯỚC PRODUCTION TÀI KHOẢN VÀ BẢO MẬT CẤU HÌNH</w:t>
+        <w:t>Trước production Tài khoản và bảo mật cấu hình</w:t>
       </w:r>
     </w:p>
     <w:p>
@@ -333,7 +408,7 @@
         <w:pStyle w:val="Heading1"/>
       </w:pPr>
       <w:r>
-        <w:t>THEO NHU CẦU BÁO CÁO NÂNG CAO</w:t>
+        <w:t>Theo nhu cầu Báo cáo nâng cao</w:t>
       </w:r>
     </w:p>
     <w:p>
@@ -370,7 +445,7 @@
         <w:pStyle w:val="Heading1"/>
       </w:pPr>
       <w:r>
-        <w:t>NGOÀI PHẠM VI MẶC ĐỊNH</w:t>
+        <w:t>Ngoài phạm vi mặc định</w:t>
       </w:r>
     </w:p>
     <w:p>
@@ -383,7 +458,7 @@
         <w:pStyle w:val="Heading1"/>
       </w:pPr>
       <w:r>
-        <w:t>THÔNG TIN CẦN CÓ KHI GIAO VIỆC</w:t>
+        <w:t>Thông tin cần có khi giao việc</w:t>
       </w:r>
     </w:p>
     <w:p>
@@ -411,7 +486,6 @@
     </w:pPr>
     <w:r>
       <w:rPr>
-        <w:rFonts w:ascii="Times New Roman" w:hAnsi="Times New Roman" w:cs="Times New Roman" w:eastAsia="Times New Roman"/>
         <w:sz w:val="18"/>
       </w:rPr>
       <w:t xml:space="preserve">ITAM  |  </w:t>
@@ -629,9 +703,9 @@
   <w:docDefaults>
     <w:rPrDefault>
       <w:rPr>
-        <w:rFonts w:ascii="Times New Roman" w:hAnsi="Times New Roman" w:cs="Times New Roman" w:eastAsia="Times New Roman"/>
-        <w:sz w:val="26"/>
-        <w:szCs w:val="26"/>
+        <w:rFonts w:asciiTheme="minorHAnsi" w:eastAsiaTheme="minorEastAsia" w:hAnsiTheme="minorHAnsi" w:cstheme="minorBidi"/>
+        <w:sz w:val="22"/>
+        <w:szCs w:val="22"/>
         <w:lang w:val="en-US" w:eastAsia="en-US" w:bidi="ar-SA"/>
       </w:rPr>
     </w:rPrDefault>
@@ -788,10 +862,9 @@
       <w:spacing w:after="120" w:line="259" w:lineRule="auto"/>
     </w:pPr>
     <w:rPr>
-      <w:rFonts w:ascii="Times New Roman" w:hAnsi="Times New Roman" w:cs="Times New Roman" w:eastAsia="Times New Roman"/>
+      <w:rFonts w:ascii="Calibri" w:hAnsi="Calibri"/>
       <w:color w:val="000000"/>
-      <w:sz w:val="26"/>
-      <w:szCs w:val="26"/>
+      <w:sz w:val="22"/>
     </w:rPr>
   </w:style>
   <w:style w:type="paragraph" w:styleId="Header">
@@ -853,13 +926,12 @@
       <w:outlineLvl w:val="0"/>
     </w:pPr>
     <w:rPr>
-      <w:rFonts w:ascii="Times New Roman" w:hAnsi="Times New Roman" w:cs="Times New Roman" w:eastAsia="Times New Roman"/>
+      <w:rFonts w:asciiTheme="majorHAnsi" w:eastAsiaTheme="majorEastAsia" w:hAnsiTheme="majorHAnsi" w:cstheme="majorBidi" w:ascii="Calibri" w:hAnsi="Calibri"/>
       <w:b/>
       <w:bCs/>
       <w:color w:val="000000"/>
-      <w:sz w:val="28"/>
+      <w:sz w:val="32"/>
       <w:szCs w:val="28"/>
-      <w:caps/>
     </w:rPr>
   </w:style>
   <w:style w:type="paragraph" w:styleId="Heading2">
@@ -878,13 +950,12 @@
       <w:outlineLvl w:val="1"/>
     </w:pPr>
     <w:rPr>
-      <w:rFonts w:ascii="Times New Roman" w:hAnsi="Times New Roman" w:cs="Times New Roman" w:eastAsia="Times New Roman"/>
+      <w:rFonts w:asciiTheme="majorHAnsi" w:eastAsiaTheme="majorEastAsia" w:hAnsiTheme="majorHAnsi" w:cstheme="majorBidi" w:ascii="Calibri" w:hAnsi="Calibri"/>
       <w:b/>
       <w:bCs/>
       <w:color w:val="000000"/>
-      <w:sz w:val="28"/>
-      <w:szCs w:val="28"/>
-      <w:caps/>
+      <w:sz w:val="26"/>
+      <w:szCs w:val="26"/>
     </w:rPr>
   </w:style>
   <w:style w:type="paragraph" w:styleId="Heading3">
@@ -903,7 +974,7 @@
       <w:outlineLvl w:val="2"/>
     </w:pPr>
     <w:rPr>
-      <w:rFonts w:ascii="Times New Roman" w:hAnsi="Times New Roman" w:cs="Times New Roman" w:eastAsia="Times New Roman"/>
+      <w:rFonts w:asciiTheme="majorHAnsi" w:eastAsiaTheme="majorEastAsia" w:hAnsiTheme="majorHAnsi" w:cstheme="majorBidi" w:ascii="Calibri" w:hAnsi="Calibri"/>
       <w:b/>
       <w:bCs/>
       <w:color w:val="000000"/>
@@ -927,7 +998,7 @@
       <w:outlineLvl w:val="3"/>
     </w:pPr>
     <w:rPr>
-      <w:rFonts w:ascii="Times New Roman" w:hAnsi="Times New Roman" w:cs="Times New Roman" w:eastAsia="Times New Roman"/>
+      <w:rFonts w:asciiTheme="majorHAnsi" w:eastAsiaTheme="majorEastAsia" w:hAnsiTheme="majorHAnsi" w:cstheme="majorBidi"/>
       <w:b/>
       <w:bCs/>
       <w:i/>
@@ -952,7 +1023,7 @@
       <w:outlineLvl w:val="4"/>
     </w:pPr>
     <w:rPr>
-      <w:rFonts w:ascii="Times New Roman" w:hAnsi="Times New Roman" w:cs="Times New Roman" w:eastAsia="Times New Roman"/>
+      <w:rFonts w:asciiTheme="majorHAnsi" w:eastAsiaTheme="majorEastAsia" w:hAnsiTheme="majorHAnsi" w:cstheme="majorBidi"/>
       <w:color w:val="243F60" w:themeColor="accent1" w:themeShade="7F"/>
     </w:rPr>
   </w:style>
@@ -973,7 +1044,7 @@
       <w:outlineLvl w:val="5"/>
     </w:pPr>
     <w:rPr>
-      <w:rFonts w:ascii="Times New Roman" w:hAnsi="Times New Roman" w:cs="Times New Roman" w:eastAsia="Times New Roman"/>
+      <w:rFonts w:asciiTheme="majorHAnsi" w:eastAsiaTheme="majorEastAsia" w:hAnsiTheme="majorHAnsi" w:cstheme="majorBidi"/>
       <w:i/>
       <w:iCs/>
       <w:color w:val="243F60" w:themeColor="accent1" w:themeShade="7F"/>
@@ -996,7 +1067,7 @@
       <w:outlineLvl w:val="6"/>
     </w:pPr>
     <w:rPr>
-      <w:rFonts w:ascii="Times New Roman" w:hAnsi="Times New Roman" w:cs="Times New Roman" w:eastAsia="Times New Roman"/>
+      <w:rFonts w:asciiTheme="majorHAnsi" w:eastAsiaTheme="majorEastAsia" w:hAnsiTheme="majorHAnsi" w:cstheme="majorBidi"/>
       <w:i/>
       <w:iCs/>
       <w:color w:val="404040" w:themeColor="text1" w:themeTint="BF"/>
@@ -1019,7 +1090,7 @@
       <w:outlineLvl w:val="7"/>
     </w:pPr>
     <w:rPr>
-      <w:rFonts w:ascii="Times New Roman" w:hAnsi="Times New Roman" w:cs="Times New Roman" w:eastAsia="Times New Roman"/>
+      <w:rFonts w:asciiTheme="majorHAnsi" w:eastAsiaTheme="majorEastAsia" w:hAnsiTheme="majorHAnsi" w:cstheme="majorBidi"/>
       <w:color w:val="4F81BD" w:themeColor="accent1"/>
       <w:sz w:val="20"/>
       <w:szCs w:val="20"/>
@@ -1042,7 +1113,7 @@
       <w:outlineLvl w:val="8"/>
     </w:pPr>
     <w:rPr>
-      <w:rFonts w:ascii="Times New Roman" w:hAnsi="Times New Roman" w:cs="Times New Roman" w:eastAsia="Times New Roman"/>
+      <w:rFonts w:asciiTheme="majorHAnsi" w:eastAsiaTheme="majorEastAsia" w:hAnsiTheme="majorHAnsi" w:cstheme="majorBidi"/>
       <w:i/>
       <w:iCs/>
       <w:color w:val="404040" w:themeColor="text1" w:themeTint="BF"/>
@@ -1093,7 +1164,7 @@
     <w:uiPriority w:val="9"/>
     <w:rsid w:val="00FC693F"/>
     <w:rPr>
-      <w:rFonts w:ascii="Times New Roman" w:hAnsi="Times New Roman" w:cs="Times New Roman" w:eastAsia="Times New Roman"/>
+      <w:rFonts w:asciiTheme="majorHAnsi" w:eastAsiaTheme="majorEastAsia" w:hAnsiTheme="majorHAnsi" w:cstheme="majorBidi"/>
       <w:b/>
       <w:bCs/>
       <w:color w:val="365F91" w:themeColor="accent1" w:themeShade="BF"/>
@@ -1108,7 +1179,7 @@
     <w:uiPriority w:val="9"/>
     <w:rsid w:val="00FC693F"/>
     <w:rPr>
-      <w:rFonts w:ascii="Times New Roman" w:hAnsi="Times New Roman" w:cs="Times New Roman" w:eastAsia="Times New Roman"/>
+      <w:rFonts w:asciiTheme="majorHAnsi" w:eastAsiaTheme="majorEastAsia" w:hAnsiTheme="majorHAnsi" w:cstheme="majorBidi"/>
       <w:b/>
       <w:bCs/>
       <w:color w:val="4F81BD" w:themeColor="accent1"/>
@@ -1123,7 +1194,7 @@
     <w:uiPriority w:val="9"/>
     <w:rsid w:val="00FC693F"/>
     <w:rPr>
-      <w:rFonts w:ascii="Times New Roman" w:hAnsi="Times New Roman" w:cs="Times New Roman" w:eastAsia="Times New Roman"/>
+      <w:rFonts w:asciiTheme="majorHAnsi" w:eastAsiaTheme="majorEastAsia" w:hAnsiTheme="majorHAnsi" w:cstheme="majorBidi"/>
       <w:b/>
       <w:bCs/>
       <w:color w:val="4F81BD" w:themeColor="accent1"/>
@@ -1145,15 +1216,12 @@
       <w:contextualSpacing/>
     </w:pPr>
     <w:rPr>
-      <w:rFonts w:ascii="Times New Roman" w:hAnsi="Times New Roman" w:cs="Times New Roman" w:eastAsia="Times New Roman"/>
+      <w:rFonts w:asciiTheme="majorHAnsi" w:eastAsiaTheme="majorEastAsia" w:hAnsiTheme="majorHAnsi" w:cstheme="majorBidi" w:ascii="Calibri" w:hAnsi="Calibri"/>
       <w:color w:val="000000"/>
       <w:spacing w:val="5"/>
       <w:kern w:val="28"/>
-      <w:sz w:val="28"/>
-      <w:szCs w:val="28"/>
-      <w:b/>
-      <w:bCs/>
-      <w:caps/>
+      <w:sz w:val="46"/>
+      <w:szCs w:val="52"/>
     </w:rPr>
   </w:style>
   <w:style w:type="character" w:customStyle="1" w:styleId="TitleChar">
@@ -1163,7 +1231,7 @@
     <w:uiPriority w:val="10"/>
     <w:rsid w:val="00FC693F"/>
     <w:rPr>
-      <w:rFonts w:ascii="Times New Roman" w:hAnsi="Times New Roman" w:cs="Times New Roman" w:eastAsia="Times New Roman"/>
+      <w:rFonts w:asciiTheme="majorHAnsi" w:eastAsiaTheme="majorEastAsia" w:hAnsiTheme="majorHAnsi" w:cstheme="majorBidi"/>
       <w:color w:val="17365D" w:themeColor="text2" w:themeShade="BF"/>
       <w:spacing w:val="5"/>
       <w:kern w:val="28"/>
@@ -1185,7 +1253,7 @@
       </w:numPr>
     </w:pPr>
     <w:rPr>
-      <w:rFonts w:ascii="Times New Roman" w:hAnsi="Times New Roman" w:cs="Times New Roman" w:eastAsia="Times New Roman"/>
+      <w:rFonts w:asciiTheme="majorHAnsi" w:eastAsiaTheme="majorEastAsia" w:hAnsiTheme="majorHAnsi" w:cstheme="majorBidi"/>
       <w:i/>
       <w:iCs/>
       <w:color w:val="4F81BD" w:themeColor="accent1"/>
@@ -1201,7 +1269,7 @@
     <w:uiPriority w:val="11"/>
     <w:rsid w:val="00FC693F"/>
     <w:rPr>
-      <w:rFonts w:ascii="Times New Roman" w:hAnsi="Times New Roman" w:cs="Times New Roman" w:eastAsia="Times New Roman"/>
+      <w:rFonts w:asciiTheme="majorHAnsi" w:eastAsiaTheme="majorEastAsia" w:hAnsiTheme="majorHAnsi" w:cstheme="majorBidi"/>
       <w:i/>
       <w:iCs/>
       <w:color w:val="4F81BD" w:themeColor="accent1"/>
@@ -1329,10 +1397,8 @@
       <w:contextualSpacing/>
     </w:pPr>
     <w:rPr>
-      <w:rFonts w:ascii="Times New Roman" w:hAnsi="Times New Roman" w:cs="Times New Roman" w:eastAsia="Times New Roman"/>
+      <w:rFonts w:ascii="Calibri" w:hAnsi="Calibri"/>
       <w:color w:val="000000"/>
-      <w:sz w:val="26"/>
-      <w:szCs w:val="26"/>
     </w:rPr>
   </w:style>
   <w:style w:type="paragraph" w:styleId="ListBullet2">
@@ -1374,7 +1440,7 @@
       <w:contextualSpacing/>
     </w:pPr>
     <w:rPr>
-      <w:rFonts w:ascii="Times New Roman" w:hAnsi="Times New Roman" w:cs="Times New Roman" w:eastAsia="Times New Roman"/>
+      <w:rFonts w:ascii="Calibri" w:hAnsi="Calibri"/>
       <w:color w:val="000000"/>
     </w:rPr>
   </w:style>
@@ -1458,7 +1524,7 @@
       </w:tabs>
     </w:pPr>
     <w:rPr>
-      <w:rFonts w:ascii="Times New Roman" w:hAnsi="Times New Roman" w:cs="Times New Roman" w:eastAsia="Times New Roman"/>
+      <w:rFonts w:ascii="Courier" w:hAnsi="Courier"/>
       <w:sz w:val="20"/>
       <w:szCs w:val="20"/>
     </w:rPr>
@@ -1470,7 +1536,7 @@
     <w:uiPriority w:val="99"/>
     <w:rsid w:val="0029639D"/>
     <w:rPr>
-      <w:rFonts w:ascii="Times New Roman" w:hAnsi="Times New Roman" w:cs="Times New Roman" w:eastAsia="Times New Roman"/>
+      <w:rFonts w:ascii="Courier" w:hAnsi="Courier"/>
       <w:sz w:val="20"/>
       <w:szCs w:val="20"/>
     </w:rPr>
@@ -1509,7 +1575,7 @@
     <w:semiHidden/>
     <w:rsid w:val="00FC693F"/>
     <w:rPr>
-      <w:rFonts w:ascii="Times New Roman" w:hAnsi="Times New Roman" w:cs="Times New Roman" w:eastAsia="Times New Roman"/>
+      <w:rFonts w:asciiTheme="majorHAnsi" w:eastAsiaTheme="majorEastAsia" w:hAnsiTheme="majorHAnsi" w:cstheme="majorBidi"/>
       <w:b/>
       <w:bCs/>
       <w:i/>
@@ -1525,7 +1591,7 @@
     <w:semiHidden/>
     <w:rsid w:val="00FC693F"/>
     <w:rPr>
-      <w:rFonts w:ascii="Times New Roman" w:hAnsi="Times New Roman" w:cs="Times New Roman" w:eastAsia="Times New Roman"/>
+      <w:rFonts w:asciiTheme="majorHAnsi" w:eastAsiaTheme="majorEastAsia" w:hAnsiTheme="majorHAnsi" w:cstheme="majorBidi"/>
       <w:color w:val="243F60" w:themeColor="accent1" w:themeShade="7F"/>
     </w:rPr>
   </w:style>
@@ -1537,7 +1603,7 @@
     <w:semiHidden/>
     <w:rsid w:val="00FC693F"/>
     <w:rPr>
-      <w:rFonts w:ascii="Times New Roman" w:hAnsi="Times New Roman" w:cs="Times New Roman" w:eastAsia="Times New Roman"/>
+      <w:rFonts w:asciiTheme="majorHAnsi" w:eastAsiaTheme="majorEastAsia" w:hAnsiTheme="majorHAnsi" w:cstheme="majorBidi"/>
       <w:i/>
       <w:iCs/>
       <w:color w:val="243F60" w:themeColor="accent1" w:themeShade="7F"/>
@@ -1551,7 +1617,7 @@
     <w:semiHidden/>
     <w:rsid w:val="00FC693F"/>
     <w:rPr>
-      <w:rFonts w:ascii="Times New Roman" w:hAnsi="Times New Roman" w:cs="Times New Roman" w:eastAsia="Times New Roman"/>
+      <w:rFonts w:asciiTheme="majorHAnsi" w:eastAsiaTheme="majorEastAsia" w:hAnsiTheme="majorHAnsi" w:cstheme="majorBidi"/>
       <w:i/>
       <w:iCs/>
       <w:color w:val="404040" w:themeColor="text1" w:themeTint="BF"/>
@@ -1565,7 +1631,7 @@
     <w:semiHidden/>
     <w:rsid w:val="00FC693F"/>
     <w:rPr>
-      <w:rFonts w:ascii="Times New Roman" w:hAnsi="Times New Roman" w:cs="Times New Roman" w:eastAsia="Times New Roman"/>
+      <w:rFonts w:asciiTheme="majorHAnsi" w:eastAsiaTheme="majorEastAsia" w:hAnsiTheme="majorHAnsi" w:cstheme="majorBidi"/>
       <w:color w:val="4F81BD" w:themeColor="accent1"/>
       <w:sz w:val="20"/>
       <w:szCs w:val="20"/>
@@ -1579,7 +1645,7 @@
     <w:semiHidden/>
     <w:rsid w:val="00FC693F"/>
     <w:rPr>
-      <w:rFonts w:ascii="Times New Roman" w:hAnsi="Times New Roman" w:cs="Times New Roman" w:eastAsia="Times New Roman"/>
+      <w:rFonts w:asciiTheme="majorHAnsi" w:eastAsiaTheme="majorEastAsia" w:hAnsiTheme="majorHAnsi" w:cstheme="majorBidi"/>
       <w:i/>
       <w:iCs/>
       <w:color w:val="404040" w:themeColor="text1" w:themeTint="BF"/>
@@ -6428,7 +6494,7 @@
       <w:spacing w:after="0" w:line="240" w:lineRule="auto"/>
     </w:pPr>
     <w:rPr>
-      <w:rFonts w:ascii="Times New Roman" w:hAnsi="Times New Roman" w:cs="Times New Roman" w:eastAsia="Times New Roman"/>
+      <w:rFonts w:asciiTheme="majorHAnsi" w:eastAsiaTheme="majorEastAsia" w:hAnsiTheme="majorHAnsi" w:cstheme="majorBidi"/>
       <w:color w:val="000000" w:themeColor="text1"/>
     </w:rPr>
     <w:tblPr>
@@ -6556,7 +6622,7 @@
       <w:spacing w:after="0" w:line="240" w:lineRule="auto"/>
     </w:pPr>
     <w:rPr>
-      <w:rFonts w:ascii="Times New Roman" w:hAnsi="Times New Roman" w:cs="Times New Roman" w:eastAsia="Times New Roman"/>
+      <w:rFonts w:asciiTheme="majorHAnsi" w:eastAsiaTheme="majorEastAsia" w:hAnsiTheme="majorHAnsi" w:cstheme="majorBidi"/>
       <w:color w:val="000000" w:themeColor="text1"/>
     </w:rPr>
     <w:tblPr>
@@ -6684,7 +6750,7 @@
       <w:spacing w:after="0" w:line="240" w:lineRule="auto"/>
     </w:pPr>
     <w:rPr>
-      <w:rFonts w:ascii="Times New Roman" w:hAnsi="Times New Roman" w:cs="Times New Roman" w:eastAsia="Times New Roman"/>
+      <w:rFonts w:asciiTheme="majorHAnsi" w:eastAsiaTheme="majorEastAsia" w:hAnsiTheme="majorHAnsi" w:cstheme="majorBidi"/>
       <w:color w:val="000000" w:themeColor="text1"/>
     </w:rPr>
     <w:tblPr>
@@ -6812,7 +6878,7 @@
       <w:spacing w:after="0" w:line="240" w:lineRule="auto"/>
     </w:pPr>
     <w:rPr>
-      <w:rFonts w:ascii="Times New Roman" w:hAnsi="Times New Roman" w:cs="Times New Roman" w:eastAsia="Times New Roman"/>
+      <w:rFonts w:asciiTheme="majorHAnsi" w:eastAsiaTheme="majorEastAsia" w:hAnsiTheme="majorHAnsi" w:cstheme="majorBidi"/>
       <w:color w:val="000000" w:themeColor="text1"/>
     </w:rPr>
     <w:tblPr>
@@ -6940,7 +7006,7 @@
       <w:spacing w:after="0" w:line="240" w:lineRule="auto"/>
     </w:pPr>
     <w:rPr>
-      <w:rFonts w:ascii="Times New Roman" w:hAnsi="Times New Roman" w:cs="Times New Roman" w:eastAsia="Times New Roman"/>
+      <w:rFonts w:asciiTheme="majorHAnsi" w:eastAsiaTheme="majorEastAsia" w:hAnsiTheme="majorHAnsi" w:cstheme="majorBidi"/>
       <w:color w:val="000000" w:themeColor="text1"/>
     </w:rPr>
     <w:tblPr>
@@ -7068,7 +7134,7 @@
       <w:spacing w:after="0" w:line="240" w:lineRule="auto"/>
     </w:pPr>
     <w:rPr>
-      <w:rFonts w:ascii="Times New Roman" w:hAnsi="Times New Roman" w:cs="Times New Roman" w:eastAsia="Times New Roman"/>
+      <w:rFonts w:asciiTheme="majorHAnsi" w:eastAsiaTheme="majorEastAsia" w:hAnsiTheme="majorHAnsi" w:cstheme="majorBidi"/>
       <w:color w:val="000000" w:themeColor="text1"/>
     </w:rPr>
     <w:tblPr>
@@ -7196,7 +7262,7 @@
       <w:spacing w:after="0" w:line="240" w:lineRule="auto"/>
     </w:pPr>
     <w:rPr>
-      <w:rFonts w:ascii="Times New Roman" w:hAnsi="Times New Roman" w:cs="Times New Roman" w:eastAsia="Times New Roman"/>
+      <w:rFonts w:asciiTheme="majorHAnsi" w:eastAsiaTheme="majorEastAsia" w:hAnsiTheme="majorHAnsi" w:cstheme="majorBidi"/>
       <w:color w:val="000000" w:themeColor="text1"/>
     </w:rPr>
     <w:tblPr>
@@ -7835,7 +7901,7 @@
       <w:spacing w:after="0" w:line="240" w:lineRule="auto"/>
     </w:pPr>
     <w:rPr>
-      <w:rFonts w:ascii="Times New Roman" w:hAnsi="Times New Roman" w:cs="Times New Roman" w:eastAsia="Times New Roman"/>
+      <w:rFonts w:asciiTheme="majorHAnsi" w:eastAsiaTheme="majorEastAsia" w:hAnsiTheme="majorHAnsi" w:cstheme="majorBidi"/>
       <w:color w:val="000000" w:themeColor="text1"/>
     </w:rPr>
     <w:tblPr>
@@ -7960,7 +8026,7 @@
       <w:spacing w:after="0" w:line="240" w:lineRule="auto"/>
     </w:pPr>
     <w:rPr>
-      <w:rFonts w:ascii="Times New Roman" w:hAnsi="Times New Roman" w:cs="Times New Roman" w:eastAsia="Times New Roman"/>
+      <w:rFonts w:asciiTheme="majorHAnsi" w:eastAsiaTheme="majorEastAsia" w:hAnsiTheme="majorHAnsi" w:cstheme="majorBidi"/>
       <w:color w:val="000000" w:themeColor="text1"/>
     </w:rPr>
     <w:tblPr>
@@ -8085,7 +8151,7 @@
       <w:spacing w:after="0" w:line="240" w:lineRule="auto"/>
     </w:pPr>
     <w:rPr>
-      <w:rFonts w:ascii="Times New Roman" w:hAnsi="Times New Roman" w:cs="Times New Roman" w:eastAsia="Times New Roman"/>
+      <w:rFonts w:asciiTheme="majorHAnsi" w:eastAsiaTheme="majorEastAsia" w:hAnsiTheme="majorHAnsi" w:cstheme="majorBidi"/>
       <w:color w:val="000000" w:themeColor="text1"/>
     </w:rPr>
     <w:tblPr>
@@ -8210,7 +8276,7 @@
       <w:spacing w:after="0" w:line="240" w:lineRule="auto"/>
     </w:pPr>
     <w:rPr>
-      <w:rFonts w:ascii="Times New Roman" w:hAnsi="Times New Roman" w:cs="Times New Roman" w:eastAsia="Times New Roman"/>
+      <w:rFonts w:asciiTheme="majorHAnsi" w:eastAsiaTheme="majorEastAsia" w:hAnsiTheme="majorHAnsi" w:cstheme="majorBidi"/>
       <w:color w:val="000000" w:themeColor="text1"/>
     </w:rPr>
     <w:tblPr>
@@ -8335,7 +8401,7 @@
       <w:spacing w:after="0" w:line="240" w:lineRule="auto"/>
     </w:pPr>
     <w:rPr>
-      <w:rFonts w:ascii="Times New Roman" w:hAnsi="Times New Roman" w:cs="Times New Roman" w:eastAsia="Times New Roman"/>
+      <w:rFonts w:asciiTheme="majorHAnsi" w:eastAsiaTheme="majorEastAsia" w:hAnsiTheme="majorHAnsi" w:cstheme="majorBidi"/>
       <w:color w:val="000000" w:themeColor="text1"/>
     </w:rPr>
     <w:tblPr>
@@ -8460,7 +8526,7 @@
       <w:spacing w:after="0" w:line="240" w:lineRule="auto"/>
     </w:pPr>
     <w:rPr>
-      <w:rFonts w:ascii="Times New Roman" w:hAnsi="Times New Roman" w:cs="Times New Roman" w:eastAsia="Times New Roman"/>
+      <w:rFonts w:asciiTheme="majorHAnsi" w:eastAsiaTheme="majorEastAsia" w:hAnsiTheme="majorHAnsi" w:cstheme="majorBidi"/>
       <w:color w:val="000000" w:themeColor="text1"/>
     </w:rPr>
     <w:tblPr>
@@ -8585,7 +8651,7 @@
       <w:spacing w:after="0" w:line="240" w:lineRule="auto"/>
     </w:pPr>
     <w:rPr>
-      <w:rFonts w:ascii="Times New Roman" w:hAnsi="Times New Roman" w:cs="Times New Roman" w:eastAsia="Times New Roman"/>
+      <w:rFonts w:asciiTheme="majorHAnsi" w:eastAsiaTheme="majorEastAsia" w:hAnsiTheme="majorHAnsi" w:cstheme="majorBidi"/>
       <w:color w:val="000000" w:themeColor="text1"/>
     </w:rPr>
     <w:tblPr>
@@ -12500,9 +12566,9 @@
   <w:docDefaults>
     <w:rPrDefault>
       <w:rPr>
-        <w:rFonts w:ascii="Times New Roman" w:hAnsi="Times New Roman" w:cs="Times New Roman" w:eastAsia="Times New Roman"/>
-        <w:sz w:val="26"/>
-        <w:szCs w:val="26"/>
+        <w:rFonts w:asciiTheme="minorHAnsi" w:eastAsiaTheme="minorEastAsia" w:hAnsiTheme="minorHAnsi" w:cstheme="minorBidi"/>
+        <w:sz w:val="22"/>
+        <w:szCs w:val="22"/>
         <w:lang w:val="en-US" w:eastAsia="en-US" w:bidi="ar-SA"/>
       </w:rPr>
     </w:rPrDefault>
@@ -12655,11 +12721,6 @@
     <w:name w:val="Normal"/>
     <w:qFormat/>
     <w:rsid w:val="00FC693F"/>
-    <w:rPr>
-      <w:rFonts w:ascii="Times New Roman" w:hAnsi="Times New Roman" w:cs="Times New Roman" w:eastAsia="Times New Roman"/>
-      <w:sz w:val="26"/>
-      <w:szCs w:val="26"/>
-    </w:rPr>
   </w:style>
   <w:style w:type="paragraph" w:styleId="Heading1">
     <w:name w:val="heading 1"/>
@@ -12676,13 +12737,12 @@
       <w:outlineLvl w:val="0"/>
     </w:pPr>
     <w:rPr>
-      <w:rFonts w:ascii="Times New Roman" w:hAnsi="Times New Roman" w:cs="Times New Roman" w:eastAsia="Times New Roman"/>
+      <w:rFonts w:asciiTheme="majorHAnsi" w:eastAsiaTheme="majorEastAsia" w:hAnsiTheme="majorHAnsi" w:cstheme="majorBidi"/>
       <w:b/>
       <w:bCs/>
       <w:color w:val="365F91" w:themeColor="accent1" w:themeShade="BF"/>
       <w:sz w:val="28"/>
       <w:szCs w:val="28"/>
-      <w:caps/>
     </w:rPr>
   </w:style>
   <w:style w:type="paragraph" w:styleId="Heading2">
@@ -12701,13 +12761,12 @@
       <w:outlineLvl w:val="1"/>
     </w:pPr>
     <w:rPr>
-      <w:rFonts w:ascii="Times New Roman" w:hAnsi="Times New Roman" w:cs="Times New Roman" w:eastAsia="Times New Roman"/>
+      <w:rFonts w:asciiTheme="majorHAnsi" w:eastAsiaTheme="majorEastAsia" w:hAnsiTheme="majorHAnsi" w:cstheme="majorBidi"/>
       <w:b/>
       <w:bCs/>
       <w:color w:val="4F81BD" w:themeColor="accent1"/>
-      <w:sz w:val="28"/>
-      <w:szCs w:val="28"/>
-      <w:caps/>
+      <w:sz w:val="26"/>
+      <w:szCs w:val="26"/>
     </w:rPr>
   </w:style>
   <w:style w:type="paragraph" w:styleId="Heading3">
@@ -12726,7 +12785,7 @@
       <w:outlineLvl w:val="2"/>
     </w:pPr>
     <w:rPr>
-      <w:rFonts w:ascii="Times New Roman" w:hAnsi="Times New Roman" w:cs="Times New Roman" w:eastAsia="Times New Roman"/>
+      <w:rFonts w:asciiTheme="majorHAnsi" w:eastAsiaTheme="majorEastAsia" w:hAnsiTheme="majorHAnsi" w:cstheme="majorBidi"/>
       <w:b/>
       <w:bCs/>
       <w:color w:val="4F81BD" w:themeColor="accent1"/>
@@ -12749,7 +12808,7 @@
       <w:outlineLvl w:val="3"/>
     </w:pPr>
     <w:rPr>
-      <w:rFonts w:ascii="Times New Roman" w:hAnsi="Times New Roman" w:cs="Times New Roman" w:eastAsia="Times New Roman"/>
+      <w:rFonts w:asciiTheme="majorHAnsi" w:eastAsiaTheme="majorEastAsia" w:hAnsiTheme="majorHAnsi" w:cstheme="majorBidi"/>
       <w:b/>
       <w:bCs/>
       <w:i/>
@@ -12774,7 +12833,7 @@
       <w:outlineLvl w:val="4"/>
     </w:pPr>
     <w:rPr>
-      <w:rFonts w:ascii="Times New Roman" w:hAnsi="Times New Roman" w:cs="Times New Roman" w:eastAsia="Times New Roman"/>
+      <w:rFonts w:asciiTheme="majorHAnsi" w:eastAsiaTheme="majorEastAsia" w:hAnsiTheme="majorHAnsi" w:cstheme="majorBidi"/>
       <w:color w:val="243F60" w:themeColor="accent1" w:themeShade="7F"/>
     </w:rPr>
   </w:style>
@@ -12795,7 +12854,7 @@
       <w:outlineLvl w:val="5"/>
     </w:pPr>
     <w:rPr>
-      <w:rFonts w:ascii="Times New Roman" w:hAnsi="Times New Roman" w:cs="Times New Roman" w:eastAsia="Times New Roman"/>
+      <w:rFonts w:asciiTheme="majorHAnsi" w:eastAsiaTheme="majorEastAsia" w:hAnsiTheme="majorHAnsi" w:cstheme="majorBidi"/>
       <w:i/>
       <w:iCs/>
       <w:color w:val="243F60" w:themeColor="accent1" w:themeShade="7F"/>
@@ -12818,7 +12877,7 @@
       <w:outlineLvl w:val="6"/>
     </w:pPr>
     <w:rPr>
-      <w:rFonts w:ascii="Times New Roman" w:hAnsi="Times New Roman" w:cs="Times New Roman" w:eastAsia="Times New Roman"/>
+      <w:rFonts w:asciiTheme="majorHAnsi" w:eastAsiaTheme="majorEastAsia" w:hAnsiTheme="majorHAnsi" w:cstheme="majorBidi"/>
       <w:i/>
       <w:iCs/>
       <w:color w:val="404040" w:themeColor="text1" w:themeTint="BF"/>
@@ -12841,7 +12900,7 @@
       <w:outlineLvl w:val="7"/>
     </w:pPr>
     <w:rPr>
-      <w:rFonts w:ascii="Times New Roman" w:hAnsi="Times New Roman" w:cs="Times New Roman" w:eastAsia="Times New Roman"/>
+      <w:rFonts w:asciiTheme="majorHAnsi" w:eastAsiaTheme="majorEastAsia" w:hAnsiTheme="majorHAnsi" w:cstheme="majorBidi"/>
       <w:color w:val="4F81BD" w:themeColor="accent1"/>
       <w:sz w:val="20"/>
       <w:szCs w:val="20"/>
@@ -12864,7 +12923,7 @@
       <w:outlineLvl w:val="8"/>
     </w:pPr>
     <w:rPr>
-      <w:rFonts w:ascii="Times New Roman" w:hAnsi="Times New Roman" w:cs="Times New Roman" w:eastAsia="Times New Roman"/>
+      <w:rFonts w:asciiTheme="majorHAnsi" w:eastAsiaTheme="majorEastAsia" w:hAnsiTheme="majorHAnsi" w:cstheme="majorBidi"/>
       <w:i/>
       <w:iCs/>
       <w:color w:val="404040" w:themeColor="text1" w:themeTint="BF"/>
@@ -12915,7 +12974,7 @@
     <w:uiPriority w:val="9"/>
     <w:rsid w:val="00FC693F"/>
     <w:rPr>
-      <w:rFonts w:ascii="Times New Roman" w:hAnsi="Times New Roman" w:cs="Times New Roman" w:eastAsia="Times New Roman"/>
+      <w:rFonts w:asciiTheme="majorHAnsi" w:eastAsiaTheme="majorEastAsia" w:hAnsiTheme="majorHAnsi" w:cstheme="majorBidi"/>
       <w:b/>
       <w:bCs/>
       <w:color w:val="365F91" w:themeColor="accent1" w:themeShade="BF"/>
@@ -12930,7 +12989,7 @@
     <w:uiPriority w:val="9"/>
     <w:rsid w:val="00FC693F"/>
     <w:rPr>
-      <w:rFonts w:ascii="Times New Roman" w:hAnsi="Times New Roman" w:cs="Times New Roman" w:eastAsia="Times New Roman"/>
+      <w:rFonts w:asciiTheme="majorHAnsi" w:eastAsiaTheme="majorEastAsia" w:hAnsiTheme="majorHAnsi" w:cstheme="majorBidi"/>
       <w:b/>
       <w:bCs/>
       <w:color w:val="4F81BD" w:themeColor="accent1"/>
@@ -12945,7 +13004,7 @@
     <w:uiPriority w:val="9"/>
     <w:rsid w:val="00FC693F"/>
     <w:rPr>
-      <w:rFonts w:ascii="Times New Roman" w:hAnsi="Times New Roman" w:cs="Times New Roman" w:eastAsia="Times New Roman"/>
+      <w:rFonts w:asciiTheme="majorHAnsi" w:eastAsiaTheme="majorEastAsia" w:hAnsiTheme="majorHAnsi" w:cstheme="majorBidi"/>
       <w:b/>
       <w:bCs/>
       <w:color w:val="4F81BD" w:themeColor="accent1"/>
@@ -12967,15 +13026,12 @@
       <w:contextualSpacing/>
     </w:pPr>
     <w:rPr>
-      <w:rFonts w:ascii="Times New Roman" w:hAnsi="Times New Roman" w:cs="Times New Roman" w:eastAsia="Times New Roman"/>
+      <w:rFonts w:asciiTheme="majorHAnsi" w:eastAsiaTheme="majorEastAsia" w:hAnsiTheme="majorHAnsi" w:cstheme="majorBidi"/>
       <w:color w:val="17365D" w:themeColor="text2" w:themeShade="BF"/>
       <w:spacing w:val="5"/>
       <w:kern w:val="28"/>
-      <w:sz w:val="28"/>
-      <w:szCs w:val="28"/>
-      <w:b/>
-      <w:bCs/>
-      <w:caps/>
+      <w:sz w:val="52"/>
+      <w:szCs w:val="52"/>
     </w:rPr>
   </w:style>
   <w:style w:type="character" w:customStyle="1" w:styleId="TitleChar">
@@ -12985,7 +13041,7 @@
     <w:uiPriority w:val="10"/>
     <w:rsid w:val="00FC693F"/>
     <w:rPr>
-      <w:rFonts w:ascii="Times New Roman" w:hAnsi="Times New Roman" w:cs="Times New Roman" w:eastAsia="Times New Roman"/>
+      <w:rFonts w:asciiTheme="majorHAnsi" w:eastAsiaTheme="majorEastAsia" w:hAnsiTheme="majorHAnsi" w:cstheme="majorBidi"/>
       <w:color w:val="17365D" w:themeColor="text2" w:themeShade="BF"/>
       <w:spacing w:val="5"/>
       <w:kern w:val="28"/>
@@ -13007,7 +13063,7 @@
       </w:numPr>
     </w:pPr>
     <w:rPr>
-      <w:rFonts w:ascii="Times New Roman" w:hAnsi="Times New Roman" w:cs="Times New Roman" w:eastAsia="Times New Roman"/>
+      <w:rFonts w:asciiTheme="majorHAnsi" w:eastAsiaTheme="majorEastAsia" w:hAnsiTheme="majorHAnsi" w:cstheme="majorBidi"/>
       <w:i/>
       <w:iCs/>
       <w:color w:val="4F81BD" w:themeColor="accent1"/>
@@ -13023,7 +13079,7 @@
     <w:uiPriority w:val="11"/>
     <w:rsid w:val="00FC693F"/>
     <w:rPr>
-      <w:rFonts w:ascii="Times New Roman" w:hAnsi="Times New Roman" w:cs="Times New Roman" w:eastAsia="Times New Roman"/>
+      <w:rFonts w:asciiTheme="majorHAnsi" w:eastAsiaTheme="majorEastAsia" w:hAnsiTheme="majorHAnsi" w:cstheme="majorBidi"/>
       <w:i/>
       <w:iCs/>
       <w:color w:val="4F81BD" w:themeColor="accent1"/>
@@ -13150,11 +13206,6 @@
       </w:numPr>
       <w:contextualSpacing/>
     </w:pPr>
-    <w:rPr>
-      <w:rFonts w:ascii="Times New Roman" w:hAnsi="Times New Roman" w:cs="Times New Roman" w:eastAsia="Times New Roman"/>
-      <w:sz w:val="26"/>
-      <w:szCs w:val="26"/>
-    </w:rPr>
   </w:style>
   <w:style w:type="paragraph" w:styleId="ListBullet2">
     <w:name w:val="List Bullet 2"/>
@@ -13275,7 +13326,7 @@
       </w:tabs>
     </w:pPr>
     <w:rPr>
-      <w:rFonts w:ascii="Times New Roman" w:hAnsi="Times New Roman" w:cs="Times New Roman" w:eastAsia="Times New Roman"/>
+      <w:rFonts w:ascii="Courier" w:hAnsi="Courier"/>
       <w:sz w:val="20"/>
       <w:szCs w:val="20"/>
     </w:rPr>
@@ -13287,7 +13338,7 @@
     <w:uiPriority w:val="99"/>
     <w:rsid w:val="0029639D"/>
     <w:rPr>
-      <w:rFonts w:ascii="Times New Roman" w:hAnsi="Times New Roman" w:cs="Times New Roman" w:eastAsia="Times New Roman"/>
+      <w:rFonts w:ascii="Courier" w:hAnsi="Courier"/>
       <w:sz w:val="20"/>
       <w:szCs w:val="20"/>
     </w:rPr>
@@ -13326,7 +13377,7 @@
     <w:semiHidden/>
     <w:rsid w:val="00FC693F"/>
     <w:rPr>
-      <w:rFonts w:ascii="Times New Roman" w:hAnsi="Times New Roman" w:cs="Times New Roman" w:eastAsia="Times New Roman"/>
+      <w:rFonts w:asciiTheme="majorHAnsi" w:eastAsiaTheme="majorEastAsia" w:hAnsiTheme="majorHAnsi" w:cstheme="majorBidi"/>
       <w:b/>
       <w:bCs/>
       <w:i/>
@@ -13342,7 +13393,7 @@
     <w:semiHidden/>
     <w:rsid w:val="00FC693F"/>
     <w:rPr>
-      <w:rFonts w:ascii="Times New Roman" w:hAnsi="Times New Roman" w:cs="Times New Roman" w:eastAsia="Times New Roman"/>
+      <w:rFonts w:asciiTheme="majorHAnsi" w:eastAsiaTheme="majorEastAsia" w:hAnsiTheme="majorHAnsi" w:cstheme="majorBidi"/>
       <w:color w:val="243F60" w:themeColor="accent1" w:themeShade="7F"/>
     </w:rPr>
   </w:style>
@@ -13354,7 +13405,7 @@
     <w:semiHidden/>
     <w:rsid w:val="00FC693F"/>
     <w:rPr>
-      <w:rFonts w:ascii="Times New Roman" w:hAnsi="Times New Roman" w:cs="Times New Roman" w:eastAsia="Times New Roman"/>
+      <w:rFonts w:asciiTheme="majorHAnsi" w:eastAsiaTheme="majorEastAsia" w:hAnsiTheme="majorHAnsi" w:cstheme="majorBidi"/>
       <w:i/>
       <w:iCs/>
       <w:color w:val="243F60" w:themeColor="accent1" w:themeShade="7F"/>
@@ -13368,7 +13419,7 @@
     <w:semiHidden/>
     <w:rsid w:val="00FC693F"/>
     <w:rPr>
-      <w:rFonts w:ascii="Times New Roman" w:hAnsi="Times New Roman" w:cs="Times New Roman" w:eastAsia="Times New Roman"/>
+      <w:rFonts w:asciiTheme="majorHAnsi" w:eastAsiaTheme="majorEastAsia" w:hAnsiTheme="majorHAnsi" w:cstheme="majorBidi"/>
       <w:i/>
       <w:iCs/>
       <w:color w:val="404040" w:themeColor="text1" w:themeTint="BF"/>
@@ -13382,7 +13433,7 @@
     <w:semiHidden/>
     <w:rsid w:val="00FC693F"/>
     <w:rPr>
-      <w:rFonts w:ascii="Times New Roman" w:hAnsi="Times New Roman" w:cs="Times New Roman" w:eastAsia="Times New Roman"/>
+      <w:rFonts w:asciiTheme="majorHAnsi" w:eastAsiaTheme="majorEastAsia" w:hAnsiTheme="majorHAnsi" w:cstheme="majorBidi"/>
       <w:color w:val="4F81BD" w:themeColor="accent1"/>
       <w:sz w:val="20"/>
       <w:szCs w:val="20"/>
@@ -13396,7 +13447,7 @@
     <w:semiHidden/>
     <w:rsid w:val="00FC693F"/>
     <w:rPr>
-      <w:rFonts w:ascii="Times New Roman" w:hAnsi="Times New Roman" w:cs="Times New Roman" w:eastAsia="Times New Roman"/>
+      <w:rFonts w:asciiTheme="majorHAnsi" w:eastAsiaTheme="majorEastAsia" w:hAnsiTheme="majorHAnsi" w:cstheme="majorBidi"/>
       <w:i/>
       <w:iCs/>
       <w:color w:val="404040" w:themeColor="text1" w:themeTint="BF"/>
@@ -18245,7 +18296,7 @@
       <w:spacing w:after="0" w:line="240" w:lineRule="auto"/>
     </w:pPr>
     <w:rPr>
-      <w:rFonts w:ascii="Times New Roman" w:hAnsi="Times New Roman" w:cs="Times New Roman" w:eastAsia="Times New Roman"/>
+      <w:rFonts w:asciiTheme="majorHAnsi" w:eastAsiaTheme="majorEastAsia" w:hAnsiTheme="majorHAnsi" w:cstheme="majorBidi"/>
       <w:color w:val="000000" w:themeColor="text1"/>
     </w:rPr>
     <w:tblPr>
@@ -18373,7 +18424,7 @@
       <w:spacing w:after="0" w:line="240" w:lineRule="auto"/>
     </w:pPr>
     <w:rPr>
-      <w:rFonts w:ascii="Times New Roman" w:hAnsi="Times New Roman" w:cs="Times New Roman" w:eastAsia="Times New Roman"/>
+      <w:rFonts w:asciiTheme="majorHAnsi" w:eastAsiaTheme="majorEastAsia" w:hAnsiTheme="majorHAnsi" w:cstheme="majorBidi"/>
       <w:color w:val="000000" w:themeColor="text1"/>
     </w:rPr>
     <w:tblPr>
@@ -18501,7 +18552,7 @@
       <w:spacing w:after="0" w:line="240" w:lineRule="auto"/>
     </w:pPr>
     <w:rPr>
-      <w:rFonts w:ascii="Times New Roman" w:hAnsi="Times New Roman" w:cs="Times New Roman" w:eastAsia="Times New Roman"/>
+      <w:rFonts w:asciiTheme="majorHAnsi" w:eastAsiaTheme="majorEastAsia" w:hAnsiTheme="majorHAnsi" w:cstheme="majorBidi"/>
       <w:color w:val="000000" w:themeColor="text1"/>
     </w:rPr>
     <w:tblPr>
@@ -18629,7 +18680,7 @@
       <w:spacing w:after="0" w:line="240" w:lineRule="auto"/>
     </w:pPr>
     <w:rPr>
-      <w:rFonts w:ascii="Times New Roman" w:hAnsi="Times New Roman" w:cs="Times New Roman" w:eastAsia="Times New Roman"/>
+      <w:rFonts w:asciiTheme="majorHAnsi" w:eastAsiaTheme="majorEastAsia" w:hAnsiTheme="majorHAnsi" w:cstheme="majorBidi"/>
       <w:color w:val="000000" w:themeColor="text1"/>
     </w:rPr>
     <w:tblPr>
@@ -18757,7 +18808,7 @@
       <w:spacing w:after="0" w:line="240" w:lineRule="auto"/>
     </w:pPr>
     <w:rPr>
-      <w:rFonts w:ascii="Times New Roman" w:hAnsi="Times New Roman" w:cs="Times New Roman" w:eastAsia="Times New Roman"/>
+      <w:rFonts w:asciiTheme="majorHAnsi" w:eastAsiaTheme="majorEastAsia" w:hAnsiTheme="majorHAnsi" w:cstheme="majorBidi"/>
       <w:color w:val="000000" w:themeColor="text1"/>
     </w:rPr>
     <w:tblPr>
@@ -18885,7 +18936,7 @@
       <w:spacing w:after="0" w:line="240" w:lineRule="auto"/>
     </w:pPr>
     <w:rPr>
-      <w:rFonts w:ascii="Times New Roman" w:hAnsi="Times New Roman" w:cs="Times New Roman" w:eastAsia="Times New Roman"/>
+      <w:rFonts w:asciiTheme="majorHAnsi" w:eastAsiaTheme="majorEastAsia" w:hAnsiTheme="majorHAnsi" w:cstheme="majorBidi"/>
       <w:color w:val="000000" w:themeColor="text1"/>
     </w:rPr>
     <w:tblPr>
@@ -19013,7 +19064,7 @@
       <w:spacing w:after="0" w:line="240" w:lineRule="auto"/>
     </w:pPr>
     <w:rPr>
-      <w:rFonts w:ascii="Times New Roman" w:hAnsi="Times New Roman" w:cs="Times New Roman" w:eastAsia="Times New Roman"/>
+      <w:rFonts w:asciiTheme="majorHAnsi" w:eastAsiaTheme="majorEastAsia" w:hAnsiTheme="majorHAnsi" w:cstheme="majorBidi"/>
       <w:color w:val="000000" w:themeColor="text1"/>
     </w:rPr>
     <w:tblPr>
@@ -19652,7 +19703,7 @@
       <w:spacing w:after="0" w:line="240" w:lineRule="auto"/>
     </w:pPr>
     <w:rPr>
-      <w:rFonts w:ascii="Times New Roman" w:hAnsi="Times New Roman" w:cs="Times New Roman" w:eastAsia="Times New Roman"/>
+      <w:rFonts w:asciiTheme="majorHAnsi" w:eastAsiaTheme="majorEastAsia" w:hAnsiTheme="majorHAnsi" w:cstheme="majorBidi"/>
       <w:color w:val="000000" w:themeColor="text1"/>
     </w:rPr>
     <w:tblPr>
@@ -19777,7 +19828,7 @@
       <w:spacing w:after="0" w:line="240" w:lineRule="auto"/>
     </w:pPr>
     <w:rPr>
-      <w:rFonts w:ascii="Times New Roman" w:hAnsi="Times New Roman" w:cs="Times New Roman" w:eastAsia="Times New Roman"/>
+      <w:rFonts w:asciiTheme="majorHAnsi" w:eastAsiaTheme="majorEastAsia" w:hAnsiTheme="majorHAnsi" w:cstheme="majorBidi"/>
       <w:color w:val="000000" w:themeColor="text1"/>
     </w:rPr>
     <w:tblPr>
@@ -19902,7 +19953,7 @@
       <w:spacing w:after="0" w:line="240" w:lineRule="auto"/>
     </w:pPr>
     <w:rPr>
-      <w:rFonts w:ascii="Times New Roman" w:hAnsi="Times New Roman" w:cs="Times New Roman" w:eastAsia="Times New Roman"/>
+      <w:rFonts w:asciiTheme="majorHAnsi" w:eastAsiaTheme="majorEastAsia" w:hAnsiTheme="majorHAnsi" w:cstheme="majorBidi"/>
       <w:color w:val="000000" w:themeColor="text1"/>
     </w:rPr>
     <w:tblPr>
@@ -20027,7 +20078,7 @@
       <w:spacing w:after="0" w:line="240" w:lineRule="auto"/>
     </w:pPr>
     <w:rPr>
-      <w:rFonts w:ascii="Times New Roman" w:hAnsi="Times New Roman" w:cs="Times New Roman" w:eastAsia="Times New Roman"/>
+      <w:rFonts w:asciiTheme="majorHAnsi" w:eastAsiaTheme="majorEastAsia" w:hAnsiTheme="majorHAnsi" w:cstheme="majorBidi"/>
       <w:color w:val="000000" w:themeColor="text1"/>
     </w:rPr>
     <w:tblPr>
@@ -20152,7 +20203,7 @@
       <w:spacing w:after="0" w:line="240" w:lineRule="auto"/>
     </w:pPr>
     <w:rPr>
-      <w:rFonts w:ascii="Times New Roman" w:hAnsi="Times New Roman" w:cs="Times New Roman" w:eastAsia="Times New Roman"/>
+      <w:rFonts w:asciiTheme="majorHAnsi" w:eastAsiaTheme="majorEastAsia" w:hAnsiTheme="majorHAnsi" w:cstheme="majorBidi"/>
       <w:color w:val="000000" w:themeColor="text1"/>
     </w:rPr>
     <w:tblPr>
@@ -20277,7 +20328,7 @@
       <w:spacing w:after="0" w:line="240" w:lineRule="auto"/>
     </w:pPr>
     <w:rPr>
-      <w:rFonts w:ascii="Times New Roman" w:hAnsi="Times New Roman" w:cs="Times New Roman" w:eastAsia="Times New Roman"/>
+      <w:rFonts w:asciiTheme="majorHAnsi" w:eastAsiaTheme="majorEastAsia" w:hAnsiTheme="majorHAnsi" w:cstheme="majorBidi"/>
       <w:color w:val="000000" w:themeColor="text1"/>
     </w:rPr>
     <w:tblPr>
@@ -20402,7 +20453,7 @@
       <w:spacing w:after="0" w:line="240" w:lineRule="auto"/>
     </w:pPr>
     <w:rPr>
-      <w:rFonts w:ascii="Times New Roman" w:hAnsi="Times New Roman" w:cs="Times New Roman" w:eastAsia="Times New Roman"/>
+      <w:rFonts w:asciiTheme="majorHAnsi" w:eastAsiaTheme="majorEastAsia" w:hAnsiTheme="majorHAnsi" w:cstheme="majorBidi"/>
       <w:color w:val="000000" w:themeColor="text1"/>
     </w:rPr>
     <w:tblPr>
@@ -24355,7 +24406,7 @@
     </a:clrScheme>
     <a:fontScheme name="Office">
       <a:majorFont>
-        <a:latin typeface="Times New Roman"/>
+        <a:latin typeface="Calibri"/>
         <a:ea typeface=""/>
         <a:cs typeface=""/>
         <a:font script="Jpan" typeface="ＭＳ ゴシック"/>
@@ -24390,7 +24441,7 @@
         <a:font script="Geor" typeface="Sylfaen"/>
       </a:majorFont>
       <a:minorFont>
-        <a:latin typeface="Times New Roman"/>
+        <a:latin typeface="Cambria"/>
         <a:ea typeface=""/>
         <a:cs typeface=""/>
         <a:font script="Jpan" typeface="ＭＳ 明朝"/>
@@ -24420,7 +24471,7 @@
         <a:font script="Laoo" typeface="DokChampa"/>
         <a:font script="Sinh" typeface="Iskoola Pota"/>
         <a:font script="Mong" typeface="Mongolian Baiti"/>
-        <a:font script="Viet" typeface="Times New Roman"/>
+        <a:font script="Viet" typeface="Arial"/>
         <a:font script="Uigh" typeface="Microsoft Uighur"/>
         <a:font script="Geor" typeface="Sylfaen"/>
       </a:minorFont>

</xml_diff>